<commit_message>
3. haftalık raporda değişiklik yapıldı
3.haftanın alınan kararlarını planlanan görevelerini karşılaşılan zoluklarını ve proje ilerlemesini içerir
</commit_message>
<xml_diff>
--- a/HaftalıkRaporlar/Haftalık Rapor 3.docx
+++ b/HaftalıkRaporlar/Haftalık Rapor 3.docx
@@ -14,7 +14,7 @@
           <w:noProof/>
         </w:rPr>
         <w:drawing>
-          <wp:anchor distT="0" distB="0" distL="114300" distR="114300" simplePos="0" relativeHeight="251658240" behindDoc="1" locked="0" layoutInCell="1" allowOverlap="1" wp14:anchorId="0AD2487E" wp14:editId="4903CAF5">
+          <wp:anchor distT="0" distB="0" distL="114300" distR="114300" simplePos="0" relativeHeight="251658240" behindDoc="1" locked="0" layoutInCell="1" allowOverlap="1" wp14:anchorId="0AD2487E" wp14:editId="6ADFBC3D">
             <wp:simplePos x="0" y="0"/>
             <wp:positionH relativeFrom="margin">
               <wp:align>right</wp:align>
@@ -187,8 +187,33 @@
           <w:sz w:val="44"/>
           <w:szCs w:val="44"/>
         </w:rPr>
-        <w:t>YMH212-Yazılım Gereksinimleri Analizi</w:t>
-      </w:r>
+        <w:t xml:space="preserve">YMH212-Yazılım </w:t>
+      </w:r>
+      <w:proofErr w:type="spellStart"/>
+      <w:r>
+        <w:rPr>
+          <w:sz w:val="44"/>
+          <w:szCs w:val="44"/>
+        </w:rPr>
+        <w:t>Gereksinimleri</w:t>
+      </w:r>
+      <w:proofErr w:type="spellEnd"/>
+      <w:r>
+        <w:rPr>
+          <w:sz w:val="44"/>
+          <w:szCs w:val="44"/>
+        </w:rPr>
+        <w:t xml:space="preserve"> </w:t>
+      </w:r>
+      <w:proofErr w:type="spellStart"/>
+      <w:r>
+        <w:rPr>
+          <w:sz w:val="44"/>
+          <w:szCs w:val="44"/>
+        </w:rPr>
+        <w:t>Analizi</w:t>
+      </w:r>
+      <w:proofErr w:type="spellEnd"/>
     </w:p>
     <w:p>
       <w:pPr>
@@ -198,19 +223,44 @@
           <w:szCs w:val="44"/>
         </w:rPr>
       </w:pPr>
+      <w:proofErr w:type="spellStart"/>
       <w:r>
         <w:rPr>
           <w:sz w:val="44"/>
           <w:szCs w:val="44"/>
         </w:rPr>
-        <w:t xml:space="preserve">Haftalık Rapor </w:t>
-      </w:r>
+        <w:t>Haftalık</w:t>
+      </w:r>
+      <w:proofErr w:type="spellEnd"/>
       <w:r>
         <w:rPr>
           <w:sz w:val="44"/>
           <w:szCs w:val="44"/>
         </w:rPr>
-        <w:t>2</w:t>
+        <w:t xml:space="preserve"> </w:t>
+      </w:r>
+      <w:proofErr w:type="spellStart"/>
+      <w:r>
+        <w:rPr>
+          <w:sz w:val="44"/>
+          <w:szCs w:val="44"/>
+        </w:rPr>
+        <w:t>Rapor</w:t>
+      </w:r>
+      <w:proofErr w:type="spellEnd"/>
+      <w:r>
+        <w:rPr>
+          <w:sz w:val="44"/>
+          <w:szCs w:val="44"/>
+        </w:rPr>
+        <w:t xml:space="preserve"> </w:t>
+      </w:r>
+      <w:r>
+        <w:rPr>
+          <w:sz w:val="44"/>
+          <w:szCs w:val="44"/>
+        </w:rPr>
+        <w:t>3</w:t>
       </w:r>
     </w:p>
     <w:p>
@@ -224,6 +274,7 @@
           <w:szCs w:val="96"/>
         </w:rPr>
       </w:pPr>
+      <w:proofErr w:type="spellStart"/>
       <w:r>
         <w:rPr>
           <w:rFonts w:ascii="Harlow Solid Italic" w:hAnsi="Harlow Solid Italic"/>
@@ -244,6 +295,7 @@
         </w:rPr>
         <w:t>xponentia</w:t>
       </w:r>
+      <w:proofErr w:type="spellEnd"/>
     </w:p>
     <w:p>
       <w:pPr>
@@ -270,6 +322,7 @@
           <w:szCs w:val="28"/>
         </w:rPr>
       </w:pPr>
+      <w:proofErr w:type="spellStart"/>
       <w:r>
         <w:rPr>
           <w:b/>
@@ -277,15 +330,46 @@
           <w:sz w:val="28"/>
           <w:szCs w:val="28"/>
         </w:rPr>
-        <w:t>Takım Adı:</w:t>
-      </w:r>
-      <w:r>
-        <w:rPr>
+        <w:t>Takım</w:t>
+      </w:r>
+      <w:proofErr w:type="spellEnd"/>
+      <w:r>
+        <w:rPr>
+          <w:b/>
+          <w:bCs/>
           <w:sz w:val="28"/>
           <w:szCs w:val="28"/>
         </w:rPr>
         <w:t xml:space="preserve"> </w:t>
       </w:r>
+      <w:proofErr w:type="spellStart"/>
+      <w:r>
+        <w:rPr>
+          <w:b/>
+          <w:bCs/>
+          <w:sz w:val="28"/>
+          <w:szCs w:val="28"/>
+        </w:rPr>
+        <w:t>Adı</w:t>
+      </w:r>
+      <w:proofErr w:type="spellEnd"/>
+      <w:r>
+        <w:rPr>
+          <w:b/>
+          <w:bCs/>
+          <w:sz w:val="28"/>
+          <w:szCs w:val="28"/>
+        </w:rPr>
+        <w:t>:</w:t>
+      </w:r>
+      <w:r>
+        <w:rPr>
+          <w:sz w:val="28"/>
+          <w:szCs w:val="28"/>
+        </w:rPr>
+        <w:t xml:space="preserve"> </w:t>
+      </w:r>
+      <w:proofErr w:type="spellStart"/>
       <w:r>
         <w:rPr>
           <w:rFonts w:ascii="Harlow Solid Italic" w:hAnsi="Harlow Solid Italic"/>
@@ -306,6 +390,7 @@
         </w:rPr>
         <w:t>xponentia</w:t>
       </w:r>
+      <w:proofErr w:type="spellEnd"/>
       <w:r>
         <w:rPr>
           <w:sz w:val="28"/>
@@ -390,6 +475,7 @@
           <w:szCs w:val="28"/>
         </w:rPr>
       </w:pPr>
+      <w:proofErr w:type="spellStart"/>
       <w:r>
         <w:rPr>
           <w:b/>
@@ -399,6 +485,7 @@
         </w:rPr>
         <w:t>Grup</w:t>
       </w:r>
+      <w:proofErr w:type="spellEnd"/>
       <w:r>
         <w:rPr>
           <w:b/>
@@ -408,6 +495,7 @@
         </w:rPr>
         <w:t xml:space="preserve"> </w:t>
       </w:r>
+      <w:proofErr w:type="spellStart"/>
       <w:r>
         <w:rPr>
           <w:b/>
@@ -415,43 +503,156 @@
           <w:sz w:val="28"/>
           <w:szCs w:val="28"/>
         </w:rPr>
-        <w:t>Üyeleri:</w:t>
-      </w:r>
-      <w:r>
-        <w:rPr>
-          <w:sz w:val="28"/>
-          <w:szCs w:val="28"/>
-        </w:rPr>
-        <w:t xml:space="preserve"> Tuna Girgin, Onur Çekiş, Yağız Öncül, Burak Özcan</w:t>
-      </w:r>
-    </w:p>
-    <w:p>
-      <w:pPr>
-        <w:spacing w:after="160" w:line="278" w:lineRule="auto"/>
-        <w:rPr>
-          <w:sz w:val="28"/>
-          <w:szCs w:val="28"/>
-        </w:rPr>
-      </w:pPr>
-    </w:p>
-    <w:p>
-      <w:pPr>
-        <w:spacing w:after="240"/>
+        <w:t>Üyeleri</w:t>
+      </w:r>
+      <w:proofErr w:type="spellEnd"/>
+      <w:r>
         <w:rPr>
           <w:b/>
           <w:bCs/>
           <w:sz w:val="28"/>
           <w:szCs w:val="28"/>
         </w:rPr>
-      </w:pPr>
-      <w:r>
+        <w:t>:</w:t>
+      </w:r>
+      <w:r>
+        <w:rPr>
+          <w:sz w:val="28"/>
+          <w:szCs w:val="28"/>
+        </w:rPr>
+        <w:t xml:space="preserve"> Tuna Girgin, Onur </w:t>
+      </w:r>
+      <w:proofErr w:type="spellStart"/>
+      <w:r>
+        <w:rPr>
+          <w:sz w:val="28"/>
+          <w:szCs w:val="28"/>
+        </w:rPr>
+        <w:t>Çekiş</w:t>
+      </w:r>
+      <w:proofErr w:type="spellEnd"/>
+      <w:r>
+        <w:rPr>
+          <w:sz w:val="28"/>
+          <w:szCs w:val="28"/>
+        </w:rPr>
+        <w:t xml:space="preserve">, Yağız </w:t>
+      </w:r>
+      <w:proofErr w:type="spellStart"/>
+      <w:r>
+        <w:rPr>
+          <w:sz w:val="28"/>
+          <w:szCs w:val="28"/>
+        </w:rPr>
+        <w:t>Öncül</w:t>
+      </w:r>
+      <w:proofErr w:type="spellEnd"/>
+      <w:r>
+        <w:rPr>
+          <w:sz w:val="28"/>
+          <w:szCs w:val="28"/>
+        </w:rPr>
+        <w:t>, Burak Özcan</w:t>
+      </w:r>
+    </w:p>
+    <w:p>
+      <w:pPr>
+        <w:spacing w:after="160" w:line="278" w:lineRule="auto"/>
+        <w:rPr>
+          <w:sz w:val="28"/>
+          <w:szCs w:val="28"/>
+        </w:rPr>
+      </w:pPr>
+    </w:p>
+    <w:p>
+      <w:pPr>
+        <w:spacing w:after="240"/>
         <w:rPr>
           <w:b/>
           <w:bCs/>
           <w:sz w:val="28"/>
           <w:szCs w:val="28"/>
         </w:rPr>
-        <w:t>Proje İlerlemesi (Gerçekleştirilen Görevler):</w:t>
+      </w:pPr>
+      <w:proofErr w:type="spellStart"/>
+      <w:r>
+        <w:rPr>
+          <w:b/>
+          <w:bCs/>
+          <w:sz w:val="28"/>
+          <w:szCs w:val="28"/>
+        </w:rPr>
+        <w:t>Proje</w:t>
+      </w:r>
+      <w:proofErr w:type="spellEnd"/>
+      <w:r>
+        <w:rPr>
+          <w:b/>
+          <w:bCs/>
+          <w:sz w:val="28"/>
+          <w:szCs w:val="28"/>
+        </w:rPr>
+        <w:t xml:space="preserve"> </w:t>
+      </w:r>
+      <w:proofErr w:type="spellStart"/>
+      <w:r>
+        <w:rPr>
+          <w:b/>
+          <w:bCs/>
+          <w:sz w:val="28"/>
+          <w:szCs w:val="28"/>
+        </w:rPr>
+        <w:t>İlerlemesi</w:t>
+      </w:r>
+      <w:proofErr w:type="spellEnd"/>
+      <w:r>
+        <w:rPr>
+          <w:b/>
+          <w:bCs/>
+          <w:sz w:val="28"/>
+          <w:szCs w:val="28"/>
+        </w:rPr>
+        <w:t xml:space="preserve"> (</w:t>
+      </w:r>
+      <w:proofErr w:type="spellStart"/>
+      <w:r>
+        <w:rPr>
+          <w:b/>
+          <w:bCs/>
+          <w:sz w:val="28"/>
+          <w:szCs w:val="28"/>
+        </w:rPr>
+        <w:t>Gerçekleştirilen</w:t>
+      </w:r>
+      <w:proofErr w:type="spellEnd"/>
+      <w:r>
+        <w:rPr>
+          <w:b/>
+          <w:bCs/>
+          <w:sz w:val="28"/>
+          <w:szCs w:val="28"/>
+        </w:rPr>
+        <w:t xml:space="preserve"> </w:t>
+      </w:r>
+      <w:proofErr w:type="spellStart"/>
+      <w:r>
+        <w:rPr>
+          <w:b/>
+          <w:bCs/>
+          <w:sz w:val="28"/>
+          <w:szCs w:val="28"/>
+        </w:rPr>
+        <w:t>Görevler</w:t>
+      </w:r>
+      <w:proofErr w:type="spellEnd"/>
+      <w:r>
+        <w:rPr>
+          <w:b/>
+          <w:bCs/>
+          <w:sz w:val="28"/>
+          <w:szCs w:val="28"/>
+        </w:rPr>
+        <w:t>):</w:t>
       </w:r>
     </w:p>
     <w:p>
@@ -470,7 +671,448 @@
         <w:rPr>
           <w:rFonts w:asciiTheme="minorHAnsi" w:hAnsiTheme="minorHAnsi"/>
         </w:rPr>
-        <w:t>Bu hafta proje yönetimi süreci üzerine konuşulmuş ve görevlerin haftalara göre dağıtılarak GitHub üzerinden takip edilmesine karar verilmiştir. Ekip içi iş yükünün daha dengeli yürütülmesi amacıyla görevler zorluk, süre ve önem derecelerine göre ağırlıklandırıl</w:t>
+        <w:t xml:space="preserve">Bu </w:t>
+      </w:r>
+      <w:proofErr w:type="spellStart"/>
+      <w:r>
+        <w:rPr>
+          <w:rFonts w:asciiTheme="minorHAnsi" w:hAnsiTheme="minorHAnsi"/>
+        </w:rPr>
+        <w:t>hafta</w:t>
+      </w:r>
+      <w:proofErr w:type="spellEnd"/>
+      <w:r>
+        <w:rPr>
+          <w:rFonts w:asciiTheme="minorHAnsi" w:hAnsiTheme="minorHAnsi"/>
+        </w:rPr>
+        <w:t xml:space="preserve"> </w:t>
+      </w:r>
+      <w:proofErr w:type="spellStart"/>
+      <w:r>
+        <w:rPr>
+          <w:rFonts w:asciiTheme="minorHAnsi" w:hAnsiTheme="minorHAnsi"/>
+        </w:rPr>
+        <w:t>proje</w:t>
+      </w:r>
+      <w:proofErr w:type="spellEnd"/>
+      <w:r>
+        <w:rPr>
+          <w:rFonts w:asciiTheme="minorHAnsi" w:hAnsiTheme="minorHAnsi"/>
+        </w:rPr>
+        <w:t xml:space="preserve"> </w:t>
+      </w:r>
+      <w:proofErr w:type="spellStart"/>
+      <w:r>
+        <w:rPr>
+          <w:rFonts w:asciiTheme="minorHAnsi" w:hAnsiTheme="minorHAnsi"/>
+        </w:rPr>
+        <w:t>yönetimi</w:t>
+      </w:r>
+      <w:proofErr w:type="spellEnd"/>
+      <w:r>
+        <w:rPr>
+          <w:rFonts w:asciiTheme="minorHAnsi" w:hAnsiTheme="minorHAnsi"/>
+        </w:rPr>
+        <w:t xml:space="preserve"> </w:t>
+      </w:r>
+      <w:proofErr w:type="spellStart"/>
+      <w:r>
+        <w:rPr>
+          <w:rFonts w:asciiTheme="minorHAnsi" w:hAnsiTheme="minorHAnsi"/>
+        </w:rPr>
+        <w:t>süreci</w:t>
+      </w:r>
+      <w:proofErr w:type="spellEnd"/>
+      <w:r>
+        <w:rPr>
+          <w:rFonts w:asciiTheme="minorHAnsi" w:hAnsiTheme="minorHAnsi"/>
+        </w:rPr>
+        <w:t xml:space="preserve"> </w:t>
+      </w:r>
+      <w:proofErr w:type="spellStart"/>
+      <w:r>
+        <w:rPr>
+          <w:rFonts w:asciiTheme="minorHAnsi" w:hAnsiTheme="minorHAnsi"/>
+        </w:rPr>
+        <w:t>üzerine</w:t>
+      </w:r>
+      <w:proofErr w:type="spellEnd"/>
+      <w:r>
+        <w:rPr>
+          <w:rFonts w:asciiTheme="minorHAnsi" w:hAnsiTheme="minorHAnsi"/>
+        </w:rPr>
+        <w:t xml:space="preserve"> </w:t>
+      </w:r>
+      <w:proofErr w:type="spellStart"/>
+      <w:r>
+        <w:rPr>
+          <w:rFonts w:asciiTheme="minorHAnsi" w:hAnsiTheme="minorHAnsi"/>
+        </w:rPr>
+        <w:t>konuşulmuş</w:t>
+      </w:r>
+      <w:proofErr w:type="spellEnd"/>
+      <w:r>
+        <w:rPr>
+          <w:rFonts w:asciiTheme="minorHAnsi" w:hAnsiTheme="minorHAnsi"/>
+        </w:rPr>
+        <w:t xml:space="preserve"> </w:t>
+      </w:r>
+      <w:proofErr w:type="spellStart"/>
+      <w:r>
+        <w:rPr>
+          <w:rFonts w:asciiTheme="minorHAnsi" w:hAnsiTheme="minorHAnsi"/>
+        </w:rPr>
+        <w:t>ve</w:t>
+      </w:r>
+      <w:proofErr w:type="spellEnd"/>
+      <w:r>
+        <w:rPr>
+          <w:rFonts w:asciiTheme="minorHAnsi" w:hAnsiTheme="minorHAnsi"/>
+        </w:rPr>
+        <w:t xml:space="preserve"> </w:t>
+      </w:r>
+      <w:proofErr w:type="spellStart"/>
+      <w:r>
+        <w:rPr>
+          <w:rFonts w:asciiTheme="minorHAnsi" w:hAnsiTheme="minorHAnsi"/>
+        </w:rPr>
+        <w:t>görevlerin</w:t>
+      </w:r>
+      <w:proofErr w:type="spellEnd"/>
+      <w:r>
+        <w:rPr>
+          <w:rFonts w:asciiTheme="minorHAnsi" w:hAnsiTheme="minorHAnsi"/>
+        </w:rPr>
+        <w:t xml:space="preserve"> </w:t>
+      </w:r>
+      <w:proofErr w:type="spellStart"/>
+      <w:r>
+        <w:rPr>
+          <w:rFonts w:asciiTheme="minorHAnsi" w:hAnsiTheme="minorHAnsi"/>
+        </w:rPr>
+        <w:t>haftalara</w:t>
+      </w:r>
+      <w:proofErr w:type="spellEnd"/>
+      <w:r>
+        <w:rPr>
+          <w:rFonts w:asciiTheme="minorHAnsi" w:hAnsiTheme="minorHAnsi"/>
+        </w:rPr>
+        <w:t xml:space="preserve"> </w:t>
+      </w:r>
+      <w:proofErr w:type="spellStart"/>
+      <w:r>
+        <w:rPr>
+          <w:rFonts w:asciiTheme="minorHAnsi" w:hAnsiTheme="minorHAnsi"/>
+        </w:rPr>
+        <w:t>göre</w:t>
+      </w:r>
+      <w:proofErr w:type="spellEnd"/>
+      <w:r>
+        <w:rPr>
+          <w:rFonts w:asciiTheme="minorHAnsi" w:hAnsiTheme="minorHAnsi"/>
+        </w:rPr>
+        <w:t xml:space="preserve"> </w:t>
+      </w:r>
+      <w:proofErr w:type="spellStart"/>
+      <w:r>
+        <w:rPr>
+          <w:rFonts w:asciiTheme="minorHAnsi" w:hAnsiTheme="minorHAnsi"/>
+        </w:rPr>
+        <w:t>dağıtılarak</w:t>
+      </w:r>
+      <w:proofErr w:type="spellEnd"/>
+      <w:r>
+        <w:rPr>
+          <w:rFonts w:asciiTheme="minorHAnsi" w:hAnsiTheme="minorHAnsi"/>
+        </w:rPr>
+        <w:t xml:space="preserve"> GitHub </w:t>
+      </w:r>
+      <w:proofErr w:type="spellStart"/>
+      <w:r>
+        <w:rPr>
+          <w:rFonts w:asciiTheme="minorHAnsi" w:hAnsiTheme="minorHAnsi"/>
+        </w:rPr>
+        <w:t>üzerinden</w:t>
+      </w:r>
+      <w:proofErr w:type="spellEnd"/>
+      <w:r>
+        <w:rPr>
+          <w:rFonts w:asciiTheme="minorHAnsi" w:hAnsiTheme="minorHAnsi"/>
+        </w:rPr>
+        <w:t xml:space="preserve"> </w:t>
+      </w:r>
+      <w:proofErr w:type="spellStart"/>
+      <w:r>
+        <w:rPr>
+          <w:rFonts w:asciiTheme="minorHAnsi" w:hAnsiTheme="minorHAnsi"/>
+        </w:rPr>
+        <w:t>takip</w:t>
+      </w:r>
+      <w:proofErr w:type="spellEnd"/>
+      <w:r>
+        <w:rPr>
+          <w:rFonts w:asciiTheme="minorHAnsi" w:hAnsiTheme="minorHAnsi"/>
+        </w:rPr>
+        <w:t xml:space="preserve"> </w:t>
+      </w:r>
+      <w:proofErr w:type="spellStart"/>
+      <w:r>
+        <w:rPr>
+          <w:rFonts w:asciiTheme="minorHAnsi" w:hAnsiTheme="minorHAnsi"/>
+        </w:rPr>
+        <w:t>edilmesine</w:t>
+      </w:r>
+      <w:proofErr w:type="spellEnd"/>
+      <w:r>
+        <w:rPr>
+          <w:rFonts w:asciiTheme="minorHAnsi" w:hAnsiTheme="minorHAnsi"/>
+        </w:rPr>
+        <w:t xml:space="preserve"> </w:t>
+      </w:r>
+      <w:proofErr w:type="spellStart"/>
+      <w:r>
+        <w:rPr>
+          <w:rFonts w:asciiTheme="minorHAnsi" w:hAnsiTheme="minorHAnsi"/>
+        </w:rPr>
+        <w:t>karar</w:t>
+      </w:r>
+      <w:proofErr w:type="spellEnd"/>
+      <w:r>
+        <w:rPr>
+          <w:rFonts w:asciiTheme="minorHAnsi" w:hAnsiTheme="minorHAnsi"/>
+        </w:rPr>
+        <w:t xml:space="preserve"> </w:t>
+      </w:r>
+      <w:proofErr w:type="spellStart"/>
+      <w:r>
+        <w:rPr>
+          <w:rFonts w:asciiTheme="minorHAnsi" w:hAnsiTheme="minorHAnsi"/>
+        </w:rPr>
+        <w:t>verilmiştir</w:t>
+      </w:r>
+      <w:proofErr w:type="spellEnd"/>
+      <w:r>
+        <w:rPr>
+          <w:rFonts w:asciiTheme="minorHAnsi" w:hAnsiTheme="minorHAnsi"/>
+        </w:rPr>
+        <w:t xml:space="preserve">. </w:t>
+      </w:r>
+      <w:proofErr w:type="spellStart"/>
+      <w:r>
+        <w:rPr>
+          <w:rFonts w:asciiTheme="minorHAnsi" w:hAnsiTheme="minorHAnsi"/>
+        </w:rPr>
+        <w:t>Ekip</w:t>
+      </w:r>
+      <w:proofErr w:type="spellEnd"/>
+      <w:r>
+        <w:rPr>
+          <w:rFonts w:asciiTheme="minorHAnsi" w:hAnsiTheme="minorHAnsi"/>
+        </w:rPr>
+        <w:t xml:space="preserve"> </w:t>
+      </w:r>
+      <w:proofErr w:type="spellStart"/>
+      <w:r>
+        <w:rPr>
+          <w:rFonts w:asciiTheme="minorHAnsi" w:hAnsiTheme="minorHAnsi"/>
+        </w:rPr>
+        <w:t>içi</w:t>
+      </w:r>
+      <w:proofErr w:type="spellEnd"/>
+      <w:r>
+        <w:rPr>
+          <w:rFonts w:asciiTheme="minorHAnsi" w:hAnsiTheme="minorHAnsi"/>
+        </w:rPr>
+        <w:t xml:space="preserve"> </w:t>
+      </w:r>
+      <w:proofErr w:type="spellStart"/>
+      <w:r>
+        <w:rPr>
+          <w:rFonts w:asciiTheme="minorHAnsi" w:hAnsiTheme="minorHAnsi"/>
+        </w:rPr>
+        <w:t>iş</w:t>
+      </w:r>
+      <w:proofErr w:type="spellEnd"/>
+      <w:r>
+        <w:rPr>
+          <w:rFonts w:asciiTheme="minorHAnsi" w:hAnsiTheme="minorHAnsi"/>
+        </w:rPr>
+        <w:t xml:space="preserve"> </w:t>
+      </w:r>
+      <w:proofErr w:type="spellStart"/>
+      <w:r>
+        <w:rPr>
+          <w:rFonts w:asciiTheme="minorHAnsi" w:hAnsiTheme="minorHAnsi"/>
+        </w:rPr>
+        <w:t>yükünün</w:t>
+      </w:r>
+      <w:proofErr w:type="spellEnd"/>
+      <w:r>
+        <w:rPr>
+          <w:rFonts w:asciiTheme="minorHAnsi" w:hAnsiTheme="minorHAnsi"/>
+        </w:rPr>
+        <w:t xml:space="preserve"> </w:t>
+      </w:r>
+      <w:proofErr w:type="spellStart"/>
+      <w:r>
+        <w:rPr>
+          <w:rFonts w:asciiTheme="minorHAnsi" w:hAnsiTheme="minorHAnsi"/>
+        </w:rPr>
+        <w:t>daha</w:t>
+      </w:r>
+      <w:proofErr w:type="spellEnd"/>
+      <w:r>
+        <w:rPr>
+          <w:rFonts w:asciiTheme="minorHAnsi" w:hAnsiTheme="minorHAnsi"/>
+        </w:rPr>
+        <w:t xml:space="preserve"> </w:t>
+      </w:r>
+      <w:proofErr w:type="spellStart"/>
+      <w:r>
+        <w:rPr>
+          <w:rFonts w:asciiTheme="minorHAnsi" w:hAnsiTheme="minorHAnsi"/>
+        </w:rPr>
+        <w:t>dengeli</w:t>
+      </w:r>
+      <w:proofErr w:type="spellEnd"/>
+      <w:r>
+        <w:rPr>
+          <w:rFonts w:asciiTheme="minorHAnsi" w:hAnsiTheme="minorHAnsi"/>
+        </w:rPr>
+        <w:t xml:space="preserve"> </w:t>
+      </w:r>
+      <w:proofErr w:type="spellStart"/>
+      <w:r>
+        <w:rPr>
+          <w:rFonts w:asciiTheme="minorHAnsi" w:hAnsiTheme="minorHAnsi"/>
+        </w:rPr>
+        <w:t>yürütülmesi</w:t>
+      </w:r>
+      <w:proofErr w:type="spellEnd"/>
+      <w:r>
+        <w:rPr>
+          <w:rFonts w:asciiTheme="minorHAnsi" w:hAnsiTheme="minorHAnsi"/>
+        </w:rPr>
+        <w:t xml:space="preserve"> </w:t>
+      </w:r>
+      <w:proofErr w:type="spellStart"/>
+      <w:r>
+        <w:rPr>
+          <w:rFonts w:asciiTheme="minorHAnsi" w:hAnsiTheme="minorHAnsi"/>
+        </w:rPr>
+        <w:t>amacıyla</w:t>
+      </w:r>
+      <w:proofErr w:type="spellEnd"/>
+      <w:r>
+        <w:rPr>
+          <w:rFonts w:asciiTheme="minorHAnsi" w:hAnsiTheme="minorHAnsi"/>
+        </w:rPr>
+        <w:t xml:space="preserve"> </w:t>
+      </w:r>
+      <w:proofErr w:type="spellStart"/>
+      <w:r>
+        <w:rPr>
+          <w:rFonts w:asciiTheme="minorHAnsi" w:hAnsiTheme="minorHAnsi"/>
+        </w:rPr>
+        <w:t>görevler</w:t>
+      </w:r>
+      <w:proofErr w:type="spellEnd"/>
+      <w:r>
+        <w:rPr>
+          <w:rFonts w:asciiTheme="minorHAnsi" w:hAnsiTheme="minorHAnsi"/>
+        </w:rPr>
+        <w:t xml:space="preserve"> </w:t>
+      </w:r>
+      <w:proofErr w:type="spellStart"/>
+      <w:r>
+        <w:rPr>
+          <w:rFonts w:asciiTheme="minorHAnsi" w:hAnsiTheme="minorHAnsi"/>
+        </w:rPr>
+        <w:t>zorluk</w:t>
+      </w:r>
+      <w:proofErr w:type="spellEnd"/>
+      <w:r>
+        <w:rPr>
+          <w:rFonts w:asciiTheme="minorHAnsi" w:hAnsiTheme="minorHAnsi"/>
+        </w:rPr>
+        <w:t xml:space="preserve">, </w:t>
+      </w:r>
+      <w:proofErr w:type="spellStart"/>
+      <w:r>
+        <w:rPr>
+          <w:rFonts w:asciiTheme="minorHAnsi" w:hAnsiTheme="minorHAnsi"/>
+        </w:rPr>
+        <w:t>süre</w:t>
+      </w:r>
+      <w:proofErr w:type="spellEnd"/>
+      <w:r>
+        <w:rPr>
+          <w:rFonts w:asciiTheme="minorHAnsi" w:hAnsiTheme="minorHAnsi"/>
+        </w:rPr>
+        <w:t xml:space="preserve"> </w:t>
+      </w:r>
+      <w:proofErr w:type="spellStart"/>
+      <w:r>
+        <w:rPr>
+          <w:rFonts w:asciiTheme="minorHAnsi" w:hAnsiTheme="minorHAnsi"/>
+        </w:rPr>
+        <w:t>ve</w:t>
+      </w:r>
+      <w:proofErr w:type="spellEnd"/>
+      <w:r>
+        <w:rPr>
+          <w:rFonts w:asciiTheme="minorHAnsi" w:hAnsiTheme="minorHAnsi"/>
+        </w:rPr>
+        <w:t xml:space="preserve"> </w:t>
+      </w:r>
+      <w:proofErr w:type="spellStart"/>
+      <w:r>
+        <w:rPr>
+          <w:rFonts w:asciiTheme="minorHAnsi" w:hAnsiTheme="minorHAnsi"/>
+        </w:rPr>
+        <w:t>önem</w:t>
+      </w:r>
+      <w:proofErr w:type="spellEnd"/>
+      <w:r>
+        <w:rPr>
+          <w:rFonts w:asciiTheme="minorHAnsi" w:hAnsiTheme="minorHAnsi"/>
+        </w:rPr>
+        <w:t xml:space="preserve"> </w:t>
+      </w:r>
+      <w:proofErr w:type="spellStart"/>
+      <w:r>
+        <w:rPr>
+          <w:rFonts w:asciiTheme="minorHAnsi" w:hAnsiTheme="minorHAnsi"/>
+        </w:rPr>
+        <w:t>derecelerine</w:t>
+      </w:r>
+      <w:proofErr w:type="spellEnd"/>
+      <w:r>
+        <w:rPr>
+          <w:rFonts w:asciiTheme="minorHAnsi" w:hAnsiTheme="minorHAnsi"/>
+        </w:rPr>
+        <w:t xml:space="preserve"> </w:t>
+      </w:r>
+      <w:proofErr w:type="spellStart"/>
+      <w:r>
+        <w:rPr>
+          <w:rFonts w:asciiTheme="minorHAnsi" w:hAnsiTheme="minorHAnsi"/>
+        </w:rPr>
+        <w:t>göre</w:t>
+      </w:r>
+      <w:proofErr w:type="spellEnd"/>
+      <w:r>
+        <w:rPr>
+          <w:rFonts w:asciiTheme="minorHAnsi" w:hAnsiTheme="minorHAnsi"/>
+        </w:rPr>
+        <w:t xml:space="preserve"> </w:t>
+      </w:r>
+      <w:proofErr w:type="spellStart"/>
+      <w:r>
+        <w:rPr>
+          <w:rFonts w:asciiTheme="minorHAnsi" w:hAnsiTheme="minorHAnsi"/>
+        </w:rPr>
+        <w:t>ağırlıklandırıl</w:t>
       </w:r>
       <w:r>
         <w:rPr>
@@ -478,11 +1120,110 @@
         </w:rPr>
         <w:t>arak</w:t>
       </w:r>
-      <w:r>
-        <w:rPr>
-          <w:rFonts w:asciiTheme="minorHAnsi" w:hAnsiTheme="minorHAnsi"/>
-        </w:rPr>
-        <w:t xml:space="preserve"> buna uygun bir görev dağılımı ve Gantt şeması hazırlanmıştır.</w:t>
+      <w:proofErr w:type="spellEnd"/>
+      <w:r>
+        <w:rPr>
+          <w:rFonts w:asciiTheme="minorHAnsi" w:hAnsiTheme="minorHAnsi"/>
+        </w:rPr>
+        <w:t xml:space="preserve"> buna </w:t>
+      </w:r>
+      <w:proofErr w:type="spellStart"/>
+      <w:r>
+        <w:rPr>
+          <w:rFonts w:asciiTheme="minorHAnsi" w:hAnsiTheme="minorHAnsi"/>
+        </w:rPr>
+        <w:t>uygun</w:t>
+      </w:r>
+      <w:proofErr w:type="spellEnd"/>
+      <w:r>
+        <w:rPr>
+          <w:rFonts w:asciiTheme="minorHAnsi" w:hAnsiTheme="minorHAnsi"/>
+        </w:rPr>
+        <w:t xml:space="preserve"> </w:t>
+      </w:r>
+      <w:proofErr w:type="spellStart"/>
+      <w:r>
+        <w:rPr>
+          <w:rFonts w:asciiTheme="minorHAnsi" w:hAnsiTheme="minorHAnsi"/>
+        </w:rPr>
+        <w:t>bir</w:t>
+      </w:r>
+      <w:proofErr w:type="spellEnd"/>
+      <w:r>
+        <w:rPr>
+          <w:rFonts w:asciiTheme="minorHAnsi" w:hAnsiTheme="minorHAnsi"/>
+        </w:rPr>
+        <w:t xml:space="preserve"> </w:t>
+      </w:r>
+      <w:proofErr w:type="spellStart"/>
+      <w:r>
+        <w:rPr>
+          <w:rFonts w:asciiTheme="minorHAnsi" w:hAnsiTheme="minorHAnsi"/>
+        </w:rPr>
+        <w:t>görev</w:t>
+      </w:r>
+      <w:proofErr w:type="spellEnd"/>
+      <w:r>
+        <w:rPr>
+          <w:rFonts w:asciiTheme="minorHAnsi" w:hAnsiTheme="minorHAnsi"/>
+        </w:rPr>
+        <w:t xml:space="preserve"> </w:t>
+      </w:r>
+      <w:proofErr w:type="spellStart"/>
+      <w:r>
+        <w:rPr>
+          <w:rFonts w:asciiTheme="minorHAnsi" w:hAnsiTheme="minorHAnsi"/>
+        </w:rPr>
+        <w:t>dağılımı</w:t>
+      </w:r>
+      <w:proofErr w:type="spellEnd"/>
+      <w:r>
+        <w:rPr>
+          <w:rFonts w:asciiTheme="minorHAnsi" w:hAnsiTheme="minorHAnsi"/>
+        </w:rPr>
+        <w:t xml:space="preserve"> </w:t>
+      </w:r>
+      <w:proofErr w:type="spellStart"/>
+      <w:r>
+        <w:rPr>
+          <w:rFonts w:asciiTheme="minorHAnsi" w:hAnsiTheme="minorHAnsi"/>
+        </w:rPr>
+        <w:t>ve</w:t>
+      </w:r>
+      <w:proofErr w:type="spellEnd"/>
+      <w:r>
+        <w:rPr>
+          <w:rFonts w:asciiTheme="minorHAnsi" w:hAnsiTheme="minorHAnsi"/>
+        </w:rPr>
+        <w:t xml:space="preserve"> Gantt </w:t>
+      </w:r>
+      <w:proofErr w:type="spellStart"/>
+      <w:r>
+        <w:rPr>
+          <w:rFonts w:asciiTheme="minorHAnsi" w:hAnsiTheme="minorHAnsi"/>
+        </w:rPr>
+        <w:t>şeması</w:t>
+      </w:r>
+      <w:proofErr w:type="spellEnd"/>
+      <w:r>
+        <w:rPr>
+          <w:rFonts w:asciiTheme="minorHAnsi" w:hAnsiTheme="minorHAnsi"/>
+        </w:rPr>
+        <w:t xml:space="preserve"> </w:t>
+      </w:r>
+      <w:proofErr w:type="spellStart"/>
+      <w:r>
+        <w:rPr>
+          <w:rFonts w:asciiTheme="minorHAnsi" w:hAnsiTheme="minorHAnsi"/>
+        </w:rPr>
+        <w:t>hazırlanmıştır</w:t>
+      </w:r>
+      <w:proofErr w:type="spellEnd"/>
+      <w:r>
+        <w:rPr>
+          <w:rFonts w:asciiTheme="minorHAnsi" w:hAnsiTheme="minorHAnsi"/>
+        </w:rPr>
+        <w:t>.</w:t>
       </w:r>
     </w:p>
     <w:p>
@@ -497,11 +1238,473 @@
           <w:rFonts w:asciiTheme="minorHAnsi" w:hAnsiTheme="minorHAnsi"/>
         </w:rPr>
       </w:pPr>
-      <w:r>
-        <w:rPr>
-          <w:rFonts w:asciiTheme="minorHAnsi" w:hAnsiTheme="minorHAnsi"/>
-        </w:rPr>
-        <w:t>Ekip üyelerinin aynı anda proje üzerinde çalışabilmesi için Unity Version Control sistemi denenmiş, ancak istenilen verim alınamadığı için proje dosyalarının GitHub’a yüklenmesi ve özellikle script tarafında pull/push mantığıyla ilerlenmesi benimsenmiştir. Böylece ekip için daha yönetilebilir bir çalışma düzeni oluşturulmuştur.</w:t>
+      <w:proofErr w:type="spellStart"/>
+      <w:r>
+        <w:rPr>
+          <w:rFonts w:asciiTheme="minorHAnsi" w:hAnsiTheme="minorHAnsi"/>
+        </w:rPr>
+        <w:t>Ekip</w:t>
+      </w:r>
+      <w:proofErr w:type="spellEnd"/>
+      <w:r>
+        <w:rPr>
+          <w:rFonts w:asciiTheme="minorHAnsi" w:hAnsiTheme="minorHAnsi"/>
+        </w:rPr>
+        <w:t xml:space="preserve"> </w:t>
+      </w:r>
+      <w:proofErr w:type="spellStart"/>
+      <w:r>
+        <w:rPr>
+          <w:rFonts w:asciiTheme="minorHAnsi" w:hAnsiTheme="minorHAnsi"/>
+        </w:rPr>
+        <w:t>üyelerinin</w:t>
+      </w:r>
+      <w:proofErr w:type="spellEnd"/>
+      <w:r>
+        <w:rPr>
+          <w:rFonts w:asciiTheme="minorHAnsi" w:hAnsiTheme="minorHAnsi"/>
+        </w:rPr>
+        <w:t xml:space="preserve"> </w:t>
+      </w:r>
+      <w:proofErr w:type="spellStart"/>
+      <w:r>
+        <w:rPr>
+          <w:rFonts w:asciiTheme="minorHAnsi" w:hAnsiTheme="minorHAnsi"/>
+        </w:rPr>
+        <w:t>aynı</w:t>
+      </w:r>
+      <w:proofErr w:type="spellEnd"/>
+      <w:r>
+        <w:rPr>
+          <w:rFonts w:asciiTheme="minorHAnsi" w:hAnsiTheme="minorHAnsi"/>
+        </w:rPr>
+        <w:t xml:space="preserve"> </w:t>
+      </w:r>
+      <w:proofErr w:type="spellStart"/>
+      <w:r>
+        <w:rPr>
+          <w:rFonts w:asciiTheme="minorHAnsi" w:hAnsiTheme="minorHAnsi"/>
+        </w:rPr>
+        <w:t>anda</w:t>
+      </w:r>
+      <w:proofErr w:type="spellEnd"/>
+      <w:r>
+        <w:rPr>
+          <w:rFonts w:asciiTheme="minorHAnsi" w:hAnsiTheme="minorHAnsi"/>
+        </w:rPr>
+        <w:t xml:space="preserve"> </w:t>
+      </w:r>
+      <w:proofErr w:type="spellStart"/>
+      <w:r>
+        <w:rPr>
+          <w:rFonts w:asciiTheme="minorHAnsi" w:hAnsiTheme="minorHAnsi"/>
+        </w:rPr>
+        <w:t>proje</w:t>
+      </w:r>
+      <w:proofErr w:type="spellEnd"/>
+      <w:r>
+        <w:rPr>
+          <w:rFonts w:asciiTheme="minorHAnsi" w:hAnsiTheme="minorHAnsi"/>
+        </w:rPr>
+        <w:t xml:space="preserve"> </w:t>
+      </w:r>
+      <w:proofErr w:type="spellStart"/>
+      <w:r>
+        <w:rPr>
+          <w:rFonts w:asciiTheme="minorHAnsi" w:hAnsiTheme="minorHAnsi"/>
+        </w:rPr>
+        <w:t>üzerinde</w:t>
+      </w:r>
+      <w:proofErr w:type="spellEnd"/>
+      <w:r>
+        <w:rPr>
+          <w:rFonts w:asciiTheme="minorHAnsi" w:hAnsiTheme="minorHAnsi"/>
+        </w:rPr>
+        <w:t xml:space="preserve"> </w:t>
+      </w:r>
+      <w:proofErr w:type="spellStart"/>
+      <w:r>
+        <w:rPr>
+          <w:rFonts w:asciiTheme="minorHAnsi" w:hAnsiTheme="minorHAnsi"/>
+        </w:rPr>
+        <w:t>çalışabilmesi</w:t>
+      </w:r>
+      <w:proofErr w:type="spellEnd"/>
+      <w:r>
+        <w:rPr>
+          <w:rFonts w:asciiTheme="minorHAnsi" w:hAnsiTheme="minorHAnsi"/>
+        </w:rPr>
+        <w:t xml:space="preserve"> </w:t>
+      </w:r>
+      <w:proofErr w:type="spellStart"/>
+      <w:r>
+        <w:rPr>
+          <w:rFonts w:asciiTheme="minorHAnsi" w:hAnsiTheme="minorHAnsi"/>
+        </w:rPr>
+        <w:t>için</w:t>
+      </w:r>
+      <w:proofErr w:type="spellEnd"/>
+      <w:r>
+        <w:rPr>
+          <w:rFonts w:asciiTheme="minorHAnsi" w:hAnsiTheme="minorHAnsi"/>
+        </w:rPr>
+        <w:t xml:space="preserve"> Unity Version Control </w:t>
+      </w:r>
+      <w:proofErr w:type="spellStart"/>
+      <w:r>
+        <w:rPr>
+          <w:rFonts w:asciiTheme="minorHAnsi" w:hAnsiTheme="minorHAnsi"/>
+        </w:rPr>
+        <w:t>denenmiş</w:t>
+      </w:r>
+      <w:proofErr w:type="spellEnd"/>
+      <w:r>
+        <w:rPr>
+          <w:rFonts w:asciiTheme="minorHAnsi" w:hAnsiTheme="minorHAnsi"/>
+        </w:rPr>
+        <w:t xml:space="preserve">, </w:t>
+      </w:r>
+      <w:proofErr w:type="spellStart"/>
+      <w:r>
+        <w:rPr>
+          <w:rFonts w:asciiTheme="minorHAnsi" w:hAnsiTheme="minorHAnsi"/>
+        </w:rPr>
+        <w:t>ancak</w:t>
+      </w:r>
+      <w:proofErr w:type="spellEnd"/>
+      <w:r>
+        <w:rPr>
+          <w:rFonts w:asciiTheme="minorHAnsi" w:hAnsiTheme="minorHAnsi"/>
+        </w:rPr>
+        <w:t xml:space="preserve"> </w:t>
+      </w:r>
+      <w:proofErr w:type="spellStart"/>
+      <w:r>
+        <w:rPr>
+          <w:rFonts w:asciiTheme="minorHAnsi" w:hAnsiTheme="minorHAnsi"/>
+        </w:rPr>
+        <w:t>istenilen</w:t>
+      </w:r>
+      <w:proofErr w:type="spellEnd"/>
+      <w:r>
+        <w:rPr>
+          <w:rFonts w:asciiTheme="minorHAnsi" w:hAnsiTheme="minorHAnsi"/>
+        </w:rPr>
+        <w:t xml:space="preserve"> </w:t>
+      </w:r>
+      <w:proofErr w:type="spellStart"/>
+      <w:r>
+        <w:rPr>
+          <w:rFonts w:asciiTheme="minorHAnsi" w:hAnsiTheme="minorHAnsi"/>
+        </w:rPr>
+        <w:t>şekilde</w:t>
+      </w:r>
+      <w:proofErr w:type="spellEnd"/>
+      <w:r>
+        <w:rPr>
+          <w:rFonts w:asciiTheme="minorHAnsi" w:hAnsiTheme="minorHAnsi"/>
+        </w:rPr>
+        <w:t xml:space="preserve"> </w:t>
+      </w:r>
+      <w:proofErr w:type="spellStart"/>
+      <w:r>
+        <w:rPr>
+          <w:rFonts w:asciiTheme="minorHAnsi" w:hAnsiTheme="minorHAnsi"/>
+        </w:rPr>
+        <w:t>çalışmadığı</w:t>
+      </w:r>
+      <w:proofErr w:type="spellEnd"/>
+      <w:r>
+        <w:rPr>
+          <w:rFonts w:asciiTheme="minorHAnsi" w:hAnsiTheme="minorHAnsi"/>
+        </w:rPr>
+        <w:t xml:space="preserve"> </w:t>
+      </w:r>
+      <w:proofErr w:type="spellStart"/>
+      <w:r>
+        <w:rPr>
+          <w:rFonts w:asciiTheme="minorHAnsi" w:hAnsiTheme="minorHAnsi"/>
+        </w:rPr>
+        <w:t>için</w:t>
+      </w:r>
+      <w:proofErr w:type="spellEnd"/>
+      <w:r>
+        <w:rPr>
+          <w:rFonts w:asciiTheme="minorHAnsi" w:hAnsiTheme="minorHAnsi"/>
+        </w:rPr>
+        <w:t xml:space="preserve"> </w:t>
+      </w:r>
+      <w:proofErr w:type="spellStart"/>
+      <w:r>
+        <w:rPr>
+          <w:rFonts w:asciiTheme="minorHAnsi" w:hAnsiTheme="minorHAnsi"/>
+        </w:rPr>
+        <w:t>proje</w:t>
+      </w:r>
+      <w:proofErr w:type="spellEnd"/>
+      <w:r>
+        <w:rPr>
+          <w:rFonts w:asciiTheme="minorHAnsi" w:hAnsiTheme="minorHAnsi"/>
+        </w:rPr>
+        <w:t xml:space="preserve"> </w:t>
+      </w:r>
+      <w:proofErr w:type="spellStart"/>
+      <w:r>
+        <w:rPr>
+          <w:rFonts w:asciiTheme="minorHAnsi" w:hAnsiTheme="minorHAnsi"/>
+        </w:rPr>
+        <w:t>dosyalarının</w:t>
+      </w:r>
+      <w:proofErr w:type="spellEnd"/>
+      <w:r>
+        <w:rPr>
+          <w:rFonts w:asciiTheme="minorHAnsi" w:hAnsiTheme="minorHAnsi"/>
+        </w:rPr>
+        <w:t xml:space="preserve"> </w:t>
+      </w:r>
+      <w:proofErr w:type="spellStart"/>
+      <w:r>
+        <w:rPr>
+          <w:rFonts w:asciiTheme="minorHAnsi" w:hAnsiTheme="minorHAnsi"/>
+        </w:rPr>
+        <w:t>GitHub’a</w:t>
+      </w:r>
+      <w:proofErr w:type="spellEnd"/>
+      <w:r>
+        <w:rPr>
+          <w:rFonts w:asciiTheme="minorHAnsi" w:hAnsiTheme="minorHAnsi"/>
+        </w:rPr>
+        <w:t xml:space="preserve"> </w:t>
+      </w:r>
+      <w:proofErr w:type="spellStart"/>
+      <w:r>
+        <w:rPr>
+          <w:rFonts w:asciiTheme="minorHAnsi" w:hAnsiTheme="minorHAnsi"/>
+        </w:rPr>
+        <w:t>yüklenmesi</w:t>
+      </w:r>
+      <w:proofErr w:type="spellEnd"/>
+      <w:r>
+        <w:rPr>
+          <w:rFonts w:asciiTheme="minorHAnsi" w:hAnsiTheme="minorHAnsi"/>
+        </w:rPr>
+        <w:t xml:space="preserve"> </w:t>
+      </w:r>
+      <w:proofErr w:type="spellStart"/>
+      <w:r>
+        <w:rPr>
+          <w:rFonts w:asciiTheme="minorHAnsi" w:hAnsiTheme="minorHAnsi"/>
+        </w:rPr>
+        <w:t>ve</w:t>
+      </w:r>
+      <w:proofErr w:type="spellEnd"/>
+      <w:r>
+        <w:rPr>
+          <w:rFonts w:asciiTheme="minorHAnsi" w:hAnsiTheme="minorHAnsi"/>
+        </w:rPr>
+        <w:t xml:space="preserve"> </w:t>
+      </w:r>
+      <w:proofErr w:type="spellStart"/>
+      <w:r>
+        <w:rPr>
+          <w:rFonts w:asciiTheme="minorHAnsi" w:hAnsiTheme="minorHAnsi"/>
+        </w:rPr>
+        <w:t>özellikle</w:t>
+      </w:r>
+      <w:proofErr w:type="spellEnd"/>
+      <w:r>
+        <w:rPr>
+          <w:rFonts w:asciiTheme="minorHAnsi" w:hAnsiTheme="minorHAnsi"/>
+        </w:rPr>
+        <w:t xml:space="preserve"> script </w:t>
+      </w:r>
+      <w:proofErr w:type="spellStart"/>
+      <w:r>
+        <w:rPr>
+          <w:rFonts w:asciiTheme="minorHAnsi" w:hAnsiTheme="minorHAnsi"/>
+        </w:rPr>
+        <w:t>tarafında</w:t>
+      </w:r>
+      <w:proofErr w:type="spellEnd"/>
+      <w:r>
+        <w:rPr>
+          <w:rFonts w:asciiTheme="minorHAnsi" w:hAnsiTheme="minorHAnsi"/>
+        </w:rPr>
+        <w:t xml:space="preserve"> pull/push </w:t>
+      </w:r>
+      <w:proofErr w:type="spellStart"/>
+      <w:r>
+        <w:rPr>
+          <w:rFonts w:asciiTheme="minorHAnsi" w:hAnsiTheme="minorHAnsi"/>
+        </w:rPr>
+        <w:t>mantığıyla</w:t>
+      </w:r>
+      <w:proofErr w:type="spellEnd"/>
+      <w:r>
+        <w:rPr>
+          <w:rFonts w:asciiTheme="minorHAnsi" w:hAnsiTheme="minorHAnsi"/>
+        </w:rPr>
+        <w:t xml:space="preserve"> </w:t>
+      </w:r>
+      <w:proofErr w:type="spellStart"/>
+      <w:r>
+        <w:rPr>
+          <w:rFonts w:asciiTheme="minorHAnsi" w:hAnsiTheme="minorHAnsi"/>
+        </w:rPr>
+        <w:t>ilerlenmesi</w:t>
+      </w:r>
+      <w:r>
+        <w:rPr>
+          <w:rFonts w:asciiTheme="minorHAnsi" w:hAnsiTheme="minorHAnsi"/>
+        </w:rPr>
+        <w:t>ne</w:t>
+      </w:r>
+      <w:proofErr w:type="spellEnd"/>
+      <w:r>
+        <w:rPr>
+          <w:rFonts w:asciiTheme="minorHAnsi" w:hAnsiTheme="minorHAnsi"/>
+        </w:rPr>
+        <w:t xml:space="preserve"> </w:t>
+      </w:r>
+      <w:proofErr w:type="spellStart"/>
+      <w:r>
+        <w:rPr>
+          <w:rFonts w:asciiTheme="minorHAnsi" w:hAnsiTheme="minorHAnsi"/>
+        </w:rPr>
+        <w:t>başlanmıştır</w:t>
+      </w:r>
+      <w:proofErr w:type="spellEnd"/>
+      <w:r>
+        <w:rPr>
+          <w:rFonts w:asciiTheme="minorHAnsi" w:hAnsiTheme="minorHAnsi"/>
+        </w:rPr>
+        <w:t xml:space="preserve">. </w:t>
+      </w:r>
+      <w:proofErr w:type="spellStart"/>
+      <w:r>
+        <w:rPr>
+          <w:rFonts w:asciiTheme="minorHAnsi" w:hAnsiTheme="minorHAnsi"/>
+        </w:rPr>
+        <w:t>Böylece</w:t>
+      </w:r>
+      <w:proofErr w:type="spellEnd"/>
+      <w:r>
+        <w:rPr>
+          <w:rFonts w:asciiTheme="minorHAnsi" w:hAnsiTheme="minorHAnsi"/>
+        </w:rPr>
+        <w:t xml:space="preserve"> </w:t>
+      </w:r>
+      <w:proofErr w:type="spellStart"/>
+      <w:r>
+        <w:rPr>
+          <w:rFonts w:asciiTheme="minorHAnsi" w:hAnsiTheme="minorHAnsi"/>
+        </w:rPr>
+        <w:t>ekip</w:t>
+      </w:r>
+      <w:proofErr w:type="spellEnd"/>
+      <w:r>
+        <w:rPr>
+          <w:rFonts w:asciiTheme="minorHAnsi" w:hAnsiTheme="minorHAnsi"/>
+        </w:rPr>
+        <w:t xml:space="preserve"> </w:t>
+      </w:r>
+      <w:proofErr w:type="spellStart"/>
+      <w:r>
+        <w:rPr>
+          <w:rFonts w:asciiTheme="minorHAnsi" w:hAnsiTheme="minorHAnsi"/>
+        </w:rPr>
+        <w:t>için</w:t>
+      </w:r>
+      <w:proofErr w:type="spellEnd"/>
+      <w:r>
+        <w:rPr>
+          <w:rFonts w:asciiTheme="minorHAnsi" w:hAnsiTheme="minorHAnsi"/>
+        </w:rPr>
+        <w:t xml:space="preserve"> </w:t>
+      </w:r>
+      <w:proofErr w:type="spellStart"/>
+      <w:r>
+        <w:rPr>
+          <w:rFonts w:asciiTheme="minorHAnsi" w:hAnsiTheme="minorHAnsi"/>
+        </w:rPr>
+        <w:t>daha</w:t>
+      </w:r>
+      <w:proofErr w:type="spellEnd"/>
+      <w:r>
+        <w:rPr>
+          <w:rFonts w:asciiTheme="minorHAnsi" w:hAnsiTheme="minorHAnsi"/>
+        </w:rPr>
+        <w:t xml:space="preserve"> </w:t>
+      </w:r>
+      <w:proofErr w:type="spellStart"/>
+      <w:r>
+        <w:rPr>
+          <w:rFonts w:asciiTheme="minorHAnsi" w:hAnsiTheme="minorHAnsi"/>
+        </w:rPr>
+        <w:t>yönetilebilir</w:t>
+      </w:r>
+      <w:proofErr w:type="spellEnd"/>
+      <w:r>
+        <w:rPr>
+          <w:rFonts w:asciiTheme="minorHAnsi" w:hAnsiTheme="minorHAnsi"/>
+        </w:rPr>
+        <w:t xml:space="preserve"> </w:t>
+      </w:r>
+      <w:proofErr w:type="spellStart"/>
+      <w:r>
+        <w:rPr>
+          <w:rFonts w:asciiTheme="minorHAnsi" w:hAnsiTheme="minorHAnsi"/>
+        </w:rPr>
+        <w:t>bir</w:t>
+      </w:r>
+      <w:proofErr w:type="spellEnd"/>
+      <w:r>
+        <w:rPr>
+          <w:rFonts w:asciiTheme="minorHAnsi" w:hAnsiTheme="minorHAnsi"/>
+        </w:rPr>
+        <w:t xml:space="preserve"> </w:t>
+      </w:r>
+      <w:proofErr w:type="spellStart"/>
+      <w:r>
+        <w:rPr>
+          <w:rFonts w:asciiTheme="minorHAnsi" w:hAnsiTheme="minorHAnsi"/>
+        </w:rPr>
+        <w:t>çalışma</w:t>
+      </w:r>
+      <w:proofErr w:type="spellEnd"/>
+      <w:r>
+        <w:rPr>
+          <w:rFonts w:asciiTheme="minorHAnsi" w:hAnsiTheme="minorHAnsi"/>
+        </w:rPr>
+        <w:t xml:space="preserve"> </w:t>
+      </w:r>
+      <w:proofErr w:type="spellStart"/>
+      <w:r>
+        <w:rPr>
+          <w:rFonts w:asciiTheme="minorHAnsi" w:hAnsiTheme="minorHAnsi"/>
+        </w:rPr>
+        <w:t>düzeni</w:t>
+      </w:r>
+      <w:proofErr w:type="spellEnd"/>
+      <w:r>
+        <w:rPr>
+          <w:rFonts w:asciiTheme="minorHAnsi" w:hAnsiTheme="minorHAnsi"/>
+        </w:rPr>
+        <w:t xml:space="preserve"> </w:t>
+      </w:r>
+      <w:proofErr w:type="spellStart"/>
+      <w:r>
+        <w:rPr>
+          <w:rFonts w:asciiTheme="minorHAnsi" w:hAnsiTheme="minorHAnsi"/>
+        </w:rPr>
+        <w:t>oluşturulmuştur</w:t>
+      </w:r>
+      <w:proofErr w:type="spellEnd"/>
+      <w:r>
+        <w:rPr>
+          <w:rFonts w:asciiTheme="minorHAnsi" w:hAnsiTheme="minorHAnsi"/>
+        </w:rPr>
+        <w:t>.</w:t>
       </w:r>
     </w:p>
     <w:p>
@@ -520,7 +1723,385 @@
         <w:rPr>
           <w:rFonts w:asciiTheme="minorHAnsi" w:hAnsiTheme="minorHAnsi"/>
         </w:rPr>
-        <w:t>Bu hafta ayrıca oyunun temel oynanış sistemleri üzerinde çalışılmaya başlanmıştır. Karakter hareketi, temel saldırı sistemi, kamera takibi ve ilk test sahnesi gibi çekirdek mekanikler proje kapsamında aktif geliştirme sürecine alınmıştır.</w:t>
+        <w:t xml:space="preserve">Bu </w:t>
+      </w:r>
+      <w:proofErr w:type="spellStart"/>
+      <w:r>
+        <w:rPr>
+          <w:rFonts w:asciiTheme="minorHAnsi" w:hAnsiTheme="minorHAnsi"/>
+        </w:rPr>
+        <w:t>hafta</w:t>
+      </w:r>
+      <w:proofErr w:type="spellEnd"/>
+      <w:r>
+        <w:rPr>
+          <w:rFonts w:asciiTheme="minorHAnsi" w:hAnsiTheme="minorHAnsi"/>
+        </w:rPr>
+        <w:t xml:space="preserve"> </w:t>
+      </w:r>
+      <w:proofErr w:type="spellStart"/>
+      <w:r>
+        <w:rPr>
+          <w:rFonts w:asciiTheme="minorHAnsi" w:hAnsiTheme="minorHAnsi"/>
+        </w:rPr>
+        <w:t>ayrıca</w:t>
+      </w:r>
+      <w:proofErr w:type="spellEnd"/>
+      <w:r>
+        <w:rPr>
+          <w:rFonts w:asciiTheme="minorHAnsi" w:hAnsiTheme="minorHAnsi"/>
+        </w:rPr>
+        <w:t xml:space="preserve"> </w:t>
+      </w:r>
+      <w:proofErr w:type="spellStart"/>
+      <w:r>
+        <w:rPr>
+          <w:rFonts w:asciiTheme="minorHAnsi" w:hAnsiTheme="minorHAnsi"/>
+        </w:rPr>
+        <w:t>oyunun</w:t>
+      </w:r>
+      <w:proofErr w:type="spellEnd"/>
+      <w:r>
+        <w:rPr>
+          <w:rFonts w:asciiTheme="minorHAnsi" w:hAnsiTheme="minorHAnsi"/>
+        </w:rPr>
+        <w:t xml:space="preserve"> </w:t>
+      </w:r>
+      <w:proofErr w:type="spellStart"/>
+      <w:r>
+        <w:rPr>
+          <w:rFonts w:asciiTheme="minorHAnsi" w:hAnsiTheme="minorHAnsi"/>
+        </w:rPr>
+        <w:t>temel</w:t>
+      </w:r>
+      <w:proofErr w:type="spellEnd"/>
+      <w:r>
+        <w:rPr>
+          <w:rFonts w:asciiTheme="minorHAnsi" w:hAnsiTheme="minorHAnsi"/>
+        </w:rPr>
+        <w:t xml:space="preserve"> </w:t>
+      </w:r>
+      <w:proofErr w:type="spellStart"/>
+      <w:r>
+        <w:rPr>
+          <w:rFonts w:asciiTheme="minorHAnsi" w:hAnsiTheme="minorHAnsi"/>
+        </w:rPr>
+        <w:t>oynanış</w:t>
+      </w:r>
+      <w:proofErr w:type="spellEnd"/>
+      <w:r>
+        <w:rPr>
+          <w:rFonts w:asciiTheme="minorHAnsi" w:hAnsiTheme="minorHAnsi"/>
+        </w:rPr>
+        <w:t xml:space="preserve"> </w:t>
+      </w:r>
+      <w:proofErr w:type="spellStart"/>
+      <w:r>
+        <w:rPr>
+          <w:rFonts w:asciiTheme="minorHAnsi" w:hAnsiTheme="minorHAnsi"/>
+        </w:rPr>
+        <w:t>sistemleri</w:t>
+      </w:r>
+      <w:proofErr w:type="spellEnd"/>
+      <w:r>
+        <w:rPr>
+          <w:rFonts w:asciiTheme="minorHAnsi" w:hAnsiTheme="minorHAnsi"/>
+        </w:rPr>
+        <w:t xml:space="preserve"> </w:t>
+      </w:r>
+      <w:proofErr w:type="spellStart"/>
+      <w:r>
+        <w:rPr>
+          <w:rFonts w:asciiTheme="minorHAnsi" w:hAnsiTheme="minorHAnsi"/>
+        </w:rPr>
+        <w:t>üzerinde</w:t>
+      </w:r>
+      <w:proofErr w:type="spellEnd"/>
+      <w:r>
+        <w:rPr>
+          <w:rFonts w:asciiTheme="minorHAnsi" w:hAnsiTheme="minorHAnsi"/>
+        </w:rPr>
+        <w:t xml:space="preserve"> </w:t>
+      </w:r>
+      <w:proofErr w:type="spellStart"/>
+      <w:r>
+        <w:rPr>
+          <w:rFonts w:asciiTheme="minorHAnsi" w:hAnsiTheme="minorHAnsi"/>
+        </w:rPr>
+        <w:t>çalışılmaya</w:t>
+      </w:r>
+      <w:proofErr w:type="spellEnd"/>
+      <w:r>
+        <w:rPr>
+          <w:rFonts w:asciiTheme="minorHAnsi" w:hAnsiTheme="minorHAnsi"/>
+        </w:rPr>
+        <w:t xml:space="preserve"> </w:t>
+      </w:r>
+      <w:proofErr w:type="spellStart"/>
+      <w:r>
+        <w:rPr>
+          <w:rFonts w:asciiTheme="minorHAnsi" w:hAnsiTheme="minorHAnsi"/>
+        </w:rPr>
+        <w:t>başlanmıştır</w:t>
+      </w:r>
+      <w:proofErr w:type="spellEnd"/>
+      <w:r>
+        <w:rPr>
+          <w:rFonts w:asciiTheme="minorHAnsi" w:hAnsiTheme="minorHAnsi"/>
+        </w:rPr>
+        <w:t xml:space="preserve">. </w:t>
+      </w:r>
+      <w:proofErr w:type="spellStart"/>
+      <w:r>
+        <w:rPr>
+          <w:rFonts w:asciiTheme="minorHAnsi" w:hAnsiTheme="minorHAnsi"/>
+        </w:rPr>
+        <w:t>Karakter</w:t>
+      </w:r>
+      <w:proofErr w:type="spellEnd"/>
+      <w:r>
+        <w:rPr>
+          <w:rFonts w:asciiTheme="minorHAnsi" w:hAnsiTheme="minorHAnsi"/>
+        </w:rPr>
+        <w:t xml:space="preserve"> </w:t>
+      </w:r>
+      <w:proofErr w:type="spellStart"/>
+      <w:r>
+        <w:rPr>
+          <w:rFonts w:asciiTheme="minorHAnsi" w:hAnsiTheme="minorHAnsi"/>
+        </w:rPr>
+        <w:t>hareketi</w:t>
+      </w:r>
+      <w:proofErr w:type="spellEnd"/>
+      <w:r>
+        <w:rPr>
+          <w:rFonts w:asciiTheme="minorHAnsi" w:hAnsiTheme="minorHAnsi"/>
+        </w:rPr>
+        <w:t xml:space="preserve">, </w:t>
+      </w:r>
+      <w:proofErr w:type="spellStart"/>
+      <w:r>
+        <w:rPr>
+          <w:rFonts w:asciiTheme="minorHAnsi" w:hAnsiTheme="minorHAnsi"/>
+        </w:rPr>
+        <w:t>temel</w:t>
+      </w:r>
+      <w:proofErr w:type="spellEnd"/>
+      <w:r>
+        <w:rPr>
+          <w:rFonts w:asciiTheme="minorHAnsi" w:hAnsiTheme="minorHAnsi"/>
+        </w:rPr>
+        <w:t xml:space="preserve"> </w:t>
+      </w:r>
+      <w:proofErr w:type="spellStart"/>
+      <w:r>
+        <w:rPr>
+          <w:rFonts w:asciiTheme="minorHAnsi" w:hAnsiTheme="minorHAnsi"/>
+        </w:rPr>
+        <w:t>saldırı</w:t>
+      </w:r>
+      <w:proofErr w:type="spellEnd"/>
+      <w:r>
+        <w:rPr>
+          <w:rFonts w:asciiTheme="minorHAnsi" w:hAnsiTheme="minorHAnsi"/>
+        </w:rPr>
+        <w:t xml:space="preserve"> </w:t>
+      </w:r>
+      <w:proofErr w:type="spellStart"/>
+      <w:r>
+        <w:rPr>
+          <w:rFonts w:asciiTheme="minorHAnsi" w:hAnsiTheme="minorHAnsi"/>
+        </w:rPr>
+        <w:t>sistemi</w:t>
+      </w:r>
+      <w:proofErr w:type="spellEnd"/>
+      <w:r>
+        <w:rPr>
+          <w:rFonts w:asciiTheme="minorHAnsi" w:hAnsiTheme="minorHAnsi"/>
+        </w:rPr>
+        <w:t xml:space="preserve">, </w:t>
+      </w:r>
+      <w:proofErr w:type="spellStart"/>
+      <w:r>
+        <w:rPr>
+          <w:rFonts w:asciiTheme="minorHAnsi" w:hAnsiTheme="minorHAnsi"/>
+        </w:rPr>
+        <w:t>kamera</w:t>
+      </w:r>
+      <w:proofErr w:type="spellEnd"/>
+      <w:r>
+        <w:rPr>
+          <w:rFonts w:asciiTheme="minorHAnsi" w:hAnsiTheme="minorHAnsi"/>
+        </w:rPr>
+        <w:t xml:space="preserve"> </w:t>
+      </w:r>
+      <w:proofErr w:type="spellStart"/>
+      <w:r>
+        <w:rPr>
+          <w:rFonts w:asciiTheme="minorHAnsi" w:hAnsiTheme="minorHAnsi"/>
+        </w:rPr>
+        <w:t>takibi</w:t>
+      </w:r>
+      <w:proofErr w:type="spellEnd"/>
+      <w:r>
+        <w:rPr>
+          <w:rFonts w:asciiTheme="minorHAnsi" w:hAnsiTheme="minorHAnsi"/>
+        </w:rPr>
+        <w:t xml:space="preserve"> </w:t>
+      </w:r>
+      <w:proofErr w:type="spellStart"/>
+      <w:r>
+        <w:rPr>
+          <w:rFonts w:asciiTheme="minorHAnsi" w:hAnsiTheme="minorHAnsi"/>
+        </w:rPr>
+        <w:t>ve</w:t>
+      </w:r>
+      <w:proofErr w:type="spellEnd"/>
+      <w:r>
+        <w:rPr>
+          <w:rFonts w:asciiTheme="minorHAnsi" w:hAnsiTheme="minorHAnsi"/>
+        </w:rPr>
+        <w:t xml:space="preserve"> ilk test </w:t>
+      </w:r>
+      <w:proofErr w:type="spellStart"/>
+      <w:r>
+        <w:rPr>
+          <w:rFonts w:asciiTheme="minorHAnsi" w:hAnsiTheme="minorHAnsi"/>
+        </w:rPr>
+        <w:t>sahnesi</w:t>
+      </w:r>
+      <w:proofErr w:type="spellEnd"/>
+      <w:r>
+        <w:rPr>
+          <w:rFonts w:asciiTheme="minorHAnsi" w:hAnsiTheme="minorHAnsi"/>
+        </w:rPr>
+        <w:t xml:space="preserve"> </w:t>
+      </w:r>
+      <w:proofErr w:type="spellStart"/>
+      <w:r>
+        <w:rPr>
+          <w:rFonts w:asciiTheme="minorHAnsi" w:hAnsiTheme="minorHAnsi"/>
+        </w:rPr>
+        <w:t>gibi</w:t>
+      </w:r>
+      <w:proofErr w:type="spellEnd"/>
+      <w:r>
+        <w:rPr>
+          <w:rFonts w:asciiTheme="minorHAnsi" w:hAnsiTheme="minorHAnsi"/>
+        </w:rPr>
+        <w:t xml:space="preserve"> </w:t>
+      </w:r>
+      <w:proofErr w:type="spellStart"/>
+      <w:r>
+        <w:rPr>
+          <w:rFonts w:asciiTheme="minorHAnsi" w:hAnsiTheme="minorHAnsi"/>
+        </w:rPr>
+        <w:t>çekirdek</w:t>
+      </w:r>
+      <w:proofErr w:type="spellEnd"/>
+      <w:r>
+        <w:rPr>
+          <w:rFonts w:asciiTheme="minorHAnsi" w:hAnsiTheme="minorHAnsi"/>
+        </w:rPr>
+        <w:t xml:space="preserve"> </w:t>
+      </w:r>
+      <w:proofErr w:type="spellStart"/>
+      <w:r>
+        <w:rPr>
+          <w:rFonts w:asciiTheme="minorHAnsi" w:hAnsiTheme="minorHAnsi"/>
+        </w:rPr>
+        <w:t>mekanikler</w:t>
+      </w:r>
+      <w:proofErr w:type="spellEnd"/>
+      <w:r>
+        <w:rPr>
+          <w:rFonts w:asciiTheme="minorHAnsi" w:hAnsiTheme="minorHAnsi"/>
+        </w:rPr>
+        <w:t xml:space="preserve"> </w:t>
+      </w:r>
+      <w:proofErr w:type="spellStart"/>
+      <w:r>
+        <w:rPr>
+          <w:rFonts w:asciiTheme="minorHAnsi" w:hAnsiTheme="minorHAnsi"/>
+        </w:rPr>
+        <w:t>proje</w:t>
+      </w:r>
+      <w:proofErr w:type="spellEnd"/>
+      <w:r>
+        <w:rPr>
+          <w:rFonts w:asciiTheme="minorHAnsi" w:hAnsiTheme="minorHAnsi"/>
+        </w:rPr>
+        <w:t xml:space="preserve"> </w:t>
+      </w:r>
+      <w:proofErr w:type="spellStart"/>
+      <w:r>
+        <w:rPr>
+          <w:rFonts w:asciiTheme="minorHAnsi" w:hAnsiTheme="minorHAnsi"/>
+        </w:rPr>
+        <w:t>kapsamında</w:t>
+      </w:r>
+      <w:proofErr w:type="spellEnd"/>
+      <w:r>
+        <w:rPr>
+          <w:rFonts w:asciiTheme="minorHAnsi" w:hAnsiTheme="minorHAnsi"/>
+        </w:rPr>
+        <w:t xml:space="preserve"> </w:t>
+      </w:r>
+      <w:proofErr w:type="spellStart"/>
+      <w:r>
+        <w:rPr>
+          <w:rFonts w:asciiTheme="minorHAnsi" w:hAnsiTheme="minorHAnsi"/>
+        </w:rPr>
+        <w:t>aktif</w:t>
+      </w:r>
+      <w:proofErr w:type="spellEnd"/>
+      <w:r>
+        <w:rPr>
+          <w:rFonts w:asciiTheme="minorHAnsi" w:hAnsiTheme="minorHAnsi"/>
+        </w:rPr>
+        <w:t xml:space="preserve"> </w:t>
+      </w:r>
+      <w:proofErr w:type="spellStart"/>
+      <w:r>
+        <w:rPr>
+          <w:rFonts w:asciiTheme="minorHAnsi" w:hAnsiTheme="minorHAnsi"/>
+        </w:rPr>
+        <w:t>geliştirme</w:t>
+      </w:r>
+      <w:proofErr w:type="spellEnd"/>
+      <w:r>
+        <w:rPr>
+          <w:rFonts w:asciiTheme="minorHAnsi" w:hAnsiTheme="minorHAnsi"/>
+        </w:rPr>
+        <w:t xml:space="preserve"> </w:t>
+      </w:r>
+      <w:proofErr w:type="spellStart"/>
+      <w:r>
+        <w:rPr>
+          <w:rFonts w:asciiTheme="minorHAnsi" w:hAnsiTheme="minorHAnsi"/>
+        </w:rPr>
+        <w:t>sürecine</w:t>
+      </w:r>
+      <w:proofErr w:type="spellEnd"/>
+      <w:r>
+        <w:rPr>
+          <w:rFonts w:asciiTheme="minorHAnsi" w:hAnsiTheme="minorHAnsi"/>
+        </w:rPr>
+        <w:t xml:space="preserve"> </w:t>
+      </w:r>
+      <w:proofErr w:type="spellStart"/>
+      <w:r>
+        <w:rPr>
+          <w:rFonts w:asciiTheme="minorHAnsi" w:hAnsiTheme="minorHAnsi"/>
+        </w:rPr>
+        <w:t>alınmıştır</w:t>
+      </w:r>
+      <w:proofErr w:type="spellEnd"/>
+      <w:r>
+        <w:rPr>
+          <w:rFonts w:asciiTheme="minorHAnsi" w:hAnsiTheme="minorHAnsi"/>
+        </w:rPr>
+        <w:t>.</w:t>
       </w:r>
     </w:p>
     <w:p>
@@ -535,23 +2116,453 @@
           <w:rFonts w:asciiTheme="minorHAnsi" w:hAnsiTheme="minorHAnsi"/>
         </w:rPr>
       </w:pPr>
-      <w:r>
-        <w:rPr>
-          <w:rFonts w:asciiTheme="minorHAnsi" w:hAnsiTheme="minorHAnsi"/>
-        </w:rPr>
-        <w:t>Paydaş analizi kapsamında proje yöneticisi, geliştiriciler, tasarımcılar, testerlar, kalite kontrol sorumluları, dokümantasyon yazarı, bakım/güncelleme sorumlusu, beta test kullanıcıları, genel oyuncu kitlesi ve son kullanıcılar belirlenmiştir. Bunlara ek olarak öğretim elemanları, olası yayıncılar</w:t>
-      </w:r>
-      <w:r>
-        <w:rPr>
-          <w:rFonts w:asciiTheme="minorHAnsi" w:hAnsiTheme="minorHAnsi"/>
-        </w:rPr>
-        <w:t xml:space="preserve"> ve </w:t>
-      </w:r>
-      <w:r>
-        <w:rPr>
-          <w:rFonts w:asciiTheme="minorHAnsi" w:hAnsiTheme="minorHAnsi"/>
-        </w:rPr>
-        <w:t>oyun toplulukları d</w:t>
+      <w:proofErr w:type="spellStart"/>
+      <w:r>
+        <w:rPr>
+          <w:rFonts w:asciiTheme="minorHAnsi" w:hAnsiTheme="minorHAnsi"/>
+        </w:rPr>
+        <w:t>Paydaş</w:t>
+      </w:r>
+      <w:proofErr w:type="spellEnd"/>
+      <w:r>
+        <w:rPr>
+          <w:rFonts w:asciiTheme="minorHAnsi" w:hAnsiTheme="minorHAnsi"/>
+        </w:rPr>
+        <w:t xml:space="preserve"> </w:t>
+      </w:r>
+      <w:proofErr w:type="spellStart"/>
+      <w:r>
+        <w:rPr>
+          <w:rFonts w:asciiTheme="minorHAnsi" w:hAnsiTheme="minorHAnsi"/>
+        </w:rPr>
+        <w:t>analizi</w:t>
+      </w:r>
+      <w:proofErr w:type="spellEnd"/>
+      <w:r>
+        <w:rPr>
+          <w:rFonts w:asciiTheme="minorHAnsi" w:hAnsiTheme="minorHAnsi"/>
+        </w:rPr>
+        <w:t xml:space="preserve"> </w:t>
+      </w:r>
+      <w:proofErr w:type="spellStart"/>
+      <w:r>
+        <w:rPr>
+          <w:rFonts w:asciiTheme="minorHAnsi" w:hAnsiTheme="minorHAnsi"/>
+        </w:rPr>
+        <w:t>kapsamında</w:t>
+      </w:r>
+      <w:proofErr w:type="spellEnd"/>
+      <w:r>
+        <w:rPr>
+          <w:rFonts w:asciiTheme="minorHAnsi" w:hAnsiTheme="minorHAnsi"/>
+        </w:rPr>
+        <w:t xml:space="preserve"> </w:t>
+      </w:r>
+      <w:proofErr w:type="spellStart"/>
+      <w:r>
+        <w:rPr>
+          <w:rFonts w:asciiTheme="minorHAnsi" w:hAnsiTheme="minorHAnsi"/>
+        </w:rPr>
+        <w:t>proje</w:t>
+      </w:r>
+      <w:proofErr w:type="spellEnd"/>
+      <w:r>
+        <w:rPr>
+          <w:rFonts w:asciiTheme="minorHAnsi" w:hAnsiTheme="minorHAnsi"/>
+        </w:rPr>
+        <w:t xml:space="preserve"> </w:t>
+      </w:r>
+      <w:proofErr w:type="spellStart"/>
+      <w:r>
+        <w:rPr>
+          <w:rFonts w:asciiTheme="minorHAnsi" w:hAnsiTheme="minorHAnsi"/>
+        </w:rPr>
+        <w:t>yöneticisi</w:t>
+      </w:r>
+      <w:proofErr w:type="spellEnd"/>
+      <w:r>
+        <w:rPr>
+          <w:rFonts w:asciiTheme="minorHAnsi" w:hAnsiTheme="minorHAnsi"/>
+        </w:rPr>
+        <w:t xml:space="preserve">, </w:t>
+      </w:r>
+      <w:proofErr w:type="spellStart"/>
+      <w:r>
+        <w:rPr>
+          <w:rFonts w:asciiTheme="minorHAnsi" w:hAnsiTheme="minorHAnsi"/>
+        </w:rPr>
+        <w:t>geliştiriciler</w:t>
+      </w:r>
+      <w:proofErr w:type="spellEnd"/>
+      <w:r>
+        <w:rPr>
+          <w:rFonts w:asciiTheme="minorHAnsi" w:hAnsiTheme="minorHAnsi"/>
+        </w:rPr>
+        <w:t xml:space="preserve">, </w:t>
+      </w:r>
+      <w:proofErr w:type="spellStart"/>
+      <w:r>
+        <w:rPr>
+          <w:rFonts w:asciiTheme="minorHAnsi" w:hAnsiTheme="minorHAnsi"/>
+        </w:rPr>
+        <w:t>tasarımcılar</w:t>
+      </w:r>
+      <w:proofErr w:type="spellEnd"/>
+      <w:r>
+        <w:rPr>
+          <w:rFonts w:asciiTheme="minorHAnsi" w:hAnsiTheme="minorHAnsi"/>
+        </w:rPr>
+        <w:t xml:space="preserve">, </w:t>
+      </w:r>
+      <w:proofErr w:type="spellStart"/>
+      <w:r>
+        <w:rPr>
+          <w:rFonts w:asciiTheme="minorHAnsi" w:hAnsiTheme="minorHAnsi"/>
+        </w:rPr>
+        <w:t>testerlar</w:t>
+      </w:r>
+      <w:proofErr w:type="spellEnd"/>
+      <w:r>
+        <w:rPr>
+          <w:rFonts w:asciiTheme="minorHAnsi" w:hAnsiTheme="minorHAnsi"/>
+        </w:rPr>
+        <w:t xml:space="preserve">, </w:t>
+      </w:r>
+      <w:proofErr w:type="spellStart"/>
+      <w:r>
+        <w:rPr>
+          <w:rFonts w:asciiTheme="minorHAnsi" w:hAnsiTheme="minorHAnsi"/>
+        </w:rPr>
+        <w:t>kalite</w:t>
+      </w:r>
+      <w:proofErr w:type="spellEnd"/>
+      <w:r>
+        <w:rPr>
+          <w:rFonts w:asciiTheme="minorHAnsi" w:hAnsiTheme="minorHAnsi"/>
+        </w:rPr>
+        <w:t xml:space="preserve"> </w:t>
+      </w:r>
+      <w:proofErr w:type="spellStart"/>
+      <w:r>
+        <w:rPr>
+          <w:rFonts w:asciiTheme="minorHAnsi" w:hAnsiTheme="minorHAnsi"/>
+        </w:rPr>
+        <w:t>kontrol</w:t>
+      </w:r>
+      <w:proofErr w:type="spellEnd"/>
+      <w:r>
+        <w:rPr>
+          <w:rFonts w:asciiTheme="minorHAnsi" w:hAnsiTheme="minorHAnsi"/>
+        </w:rPr>
+        <w:t xml:space="preserve"> </w:t>
+      </w:r>
+      <w:proofErr w:type="spellStart"/>
+      <w:r>
+        <w:rPr>
+          <w:rFonts w:asciiTheme="minorHAnsi" w:hAnsiTheme="minorHAnsi"/>
+        </w:rPr>
+        <w:t>sorumluları</w:t>
+      </w:r>
+      <w:proofErr w:type="spellEnd"/>
+      <w:r>
+        <w:rPr>
+          <w:rFonts w:asciiTheme="minorHAnsi" w:hAnsiTheme="minorHAnsi"/>
+        </w:rPr>
+        <w:t xml:space="preserve">, </w:t>
+      </w:r>
+      <w:proofErr w:type="spellStart"/>
+      <w:r>
+        <w:rPr>
+          <w:rFonts w:asciiTheme="minorHAnsi" w:hAnsiTheme="minorHAnsi"/>
+        </w:rPr>
+        <w:t>dokümantasyon</w:t>
+      </w:r>
+      <w:proofErr w:type="spellEnd"/>
+      <w:r>
+        <w:rPr>
+          <w:rFonts w:asciiTheme="minorHAnsi" w:hAnsiTheme="minorHAnsi"/>
+        </w:rPr>
+        <w:t xml:space="preserve"> </w:t>
+      </w:r>
+      <w:proofErr w:type="spellStart"/>
+      <w:r>
+        <w:rPr>
+          <w:rFonts w:asciiTheme="minorHAnsi" w:hAnsiTheme="minorHAnsi"/>
+        </w:rPr>
+        <w:t>yazarı</w:t>
+      </w:r>
+      <w:proofErr w:type="spellEnd"/>
+      <w:r>
+        <w:rPr>
+          <w:rFonts w:asciiTheme="minorHAnsi" w:hAnsiTheme="minorHAnsi"/>
+        </w:rPr>
+        <w:t xml:space="preserve">, </w:t>
+      </w:r>
+      <w:proofErr w:type="spellStart"/>
+      <w:r>
+        <w:rPr>
+          <w:rFonts w:asciiTheme="minorHAnsi" w:hAnsiTheme="minorHAnsi"/>
+        </w:rPr>
+        <w:t>bakım</w:t>
+      </w:r>
+      <w:proofErr w:type="spellEnd"/>
+      <w:r>
+        <w:rPr>
+          <w:rFonts w:asciiTheme="minorHAnsi" w:hAnsiTheme="minorHAnsi"/>
+        </w:rPr>
+        <w:t>/</w:t>
+      </w:r>
+      <w:proofErr w:type="spellStart"/>
+      <w:r>
+        <w:rPr>
+          <w:rFonts w:asciiTheme="minorHAnsi" w:hAnsiTheme="minorHAnsi"/>
+        </w:rPr>
+        <w:t>güncelleme</w:t>
+      </w:r>
+      <w:proofErr w:type="spellEnd"/>
+      <w:r>
+        <w:rPr>
+          <w:rFonts w:asciiTheme="minorHAnsi" w:hAnsiTheme="minorHAnsi"/>
+        </w:rPr>
+        <w:t xml:space="preserve"> </w:t>
+      </w:r>
+      <w:proofErr w:type="spellStart"/>
+      <w:r>
+        <w:rPr>
+          <w:rFonts w:asciiTheme="minorHAnsi" w:hAnsiTheme="minorHAnsi"/>
+        </w:rPr>
+        <w:t>sorumlusu</w:t>
+      </w:r>
+      <w:proofErr w:type="spellEnd"/>
+      <w:r>
+        <w:rPr>
+          <w:rFonts w:asciiTheme="minorHAnsi" w:hAnsiTheme="minorHAnsi"/>
+        </w:rPr>
+        <w:t xml:space="preserve">, beta test </w:t>
+      </w:r>
+      <w:proofErr w:type="spellStart"/>
+      <w:r>
+        <w:rPr>
+          <w:rFonts w:asciiTheme="minorHAnsi" w:hAnsiTheme="minorHAnsi"/>
+        </w:rPr>
+        <w:t>kullanıcıları</w:t>
+      </w:r>
+      <w:proofErr w:type="spellEnd"/>
+      <w:r>
+        <w:rPr>
+          <w:rFonts w:asciiTheme="minorHAnsi" w:hAnsiTheme="minorHAnsi"/>
+        </w:rPr>
+        <w:t xml:space="preserve">, </w:t>
+      </w:r>
+      <w:proofErr w:type="spellStart"/>
+      <w:r>
+        <w:rPr>
+          <w:rFonts w:asciiTheme="minorHAnsi" w:hAnsiTheme="minorHAnsi"/>
+        </w:rPr>
+        <w:t>genel</w:t>
+      </w:r>
+      <w:proofErr w:type="spellEnd"/>
+      <w:r>
+        <w:rPr>
+          <w:rFonts w:asciiTheme="minorHAnsi" w:hAnsiTheme="minorHAnsi"/>
+        </w:rPr>
+        <w:t xml:space="preserve"> </w:t>
+      </w:r>
+      <w:proofErr w:type="spellStart"/>
+      <w:r>
+        <w:rPr>
+          <w:rFonts w:asciiTheme="minorHAnsi" w:hAnsiTheme="minorHAnsi"/>
+        </w:rPr>
+        <w:t>oyuncu</w:t>
+      </w:r>
+      <w:proofErr w:type="spellEnd"/>
+      <w:r>
+        <w:rPr>
+          <w:rFonts w:asciiTheme="minorHAnsi" w:hAnsiTheme="minorHAnsi"/>
+        </w:rPr>
+        <w:t xml:space="preserve"> </w:t>
+      </w:r>
+      <w:proofErr w:type="spellStart"/>
+      <w:r>
+        <w:rPr>
+          <w:rFonts w:asciiTheme="minorHAnsi" w:hAnsiTheme="minorHAnsi"/>
+        </w:rPr>
+        <w:t>kitlesi</w:t>
+      </w:r>
+      <w:proofErr w:type="spellEnd"/>
+      <w:r>
+        <w:rPr>
+          <w:rFonts w:asciiTheme="minorHAnsi" w:hAnsiTheme="minorHAnsi"/>
+        </w:rPr>
+        <w:t xml:space="preserve"> </w:t>
+      </w:r>
+      <w:proofErr w:type="spellStart"/>
+      <w:r>
+        <w:rPr>
+          <w:rFonts w:asciiTheme="minorHAnsi" w:hAnsiTheme="minorHAnsi"/>
+        </w:rPr>
+        <w:t>ve</w:t>
+      </w:r>
+      <w:proofErr w:type="spellEnd"/>
+      <w:r>
+        <w:rPr>
+          <w:rFonts w:asciiTheme="minorHAnsi" w:hAnsiTheme="minorHAnsi"/>
+        </w:rPr>
+        <w:t xml:space="preserve"> son </w:t>
+      </w:r>
+      <w:proofErr w:type="spellStart"/>
+      <w:r>
+        <w:rPr>
+          <w:rFonts w:asciiTheme="minorHAnsi" w:hAnsiTheme="minorHAnsi"/>
+        </w:rPr>
+        <w:t>kullanıcılar</w:t>
+      </w:r>
+      <w:proofErr w:type="spellEnd"/>
+      <w:r>
+        <w:rPr>
+          <w:rFonts w:asciiTheme="minorHAnsi" w:hAnsiTheme="minorHAnsi"/>
+        </w:rPr>
+        <w:t xml:space="preserve"> </w:t>
+      </w:r>
+      <w:proofErr w:type="spellStart"/>
+      <w:r>
+        <w:rPr>
+          <w:rFonts w:asciiTheme="minorHAnsi" w:hAnsiTheme="minorHAnsi"/>
+        </w:rPr>
+        <w:t>belirlenmiştir</w:t>
+      </w:r>
+      <w:proofErr w:type="spellEnd"/>
+      <w:r>
+        <w:rPr>
+          <w:rFonts w:asciiTheme="minorHAnsi" w:hAnsiTheme="minorHAnsi"/>
+        </w:rPr>
+        <w:t xml:space="preserve">. </w:t>
+      </w:r>
+      <w:proofErr w:type="spellStart"/>
+      <w:r>
+        <w:rPr>
+          <w:rFonts w:asciiTheme="minorHAnsi" w:hAnsiTheme="minorHAnsi"/>
+        </w:rPr>
+        <w:t>Bunlara</w:t>
+      </w:r>
+      <w:proofErr w:type="spellEnd"/>
+      <w:r>
+        <w:rPr>
+          <w:rFonts w:asciiTheme="minorHAnsi" w:hAnsiTheme="minorHAnsi"/>
+        </w:rPr>
+        <w:t xml:space="preserve"> ek </w:t>
+      </w:r>
+      <w:proofErr w:type="spellStart"/>
+      <w:r>
+        <w:rPr>
+          <w:rFonts w:asciiTheme="minorHAnsi" w:hAnsiTheme="minorHAnsi"/>
+        </w:rPr>
+        <w:t>olarak</w:t>
+      </w:r>
+      <w:proofErr w:type="spellEnd"/>
+      <w:r>
+        <w:rPr>
+          <w:rFonts w:asciiTheme="minorHAnsi" w:hAnsiTheme="minorHAnsi"/>
+        </w:rPr>
+        <w:t xml:space="preserve"> </w:t>
+      </w:r>
+      <w:proofErr w:type="spellStart"/>
+      <w:r>
+        <w:rPr>
+          <w:rFonts w:asciiTheme="minorHAnsi" w:hAnsiTheme="minorHAnsi"/>
+        </w:rPr>
+        <w:t>öğretim</w:t>
+      </w:r>
+      <w:proofErr w:type="spellEnd"/>
+      <w:r>
+        <w:rPr>
+          <w:rFonts w:asciiTheme="minorHAnsi" w:hAnsiTheme="minorHAnsi"/>
+        </w:rPr>
+        <w:t xml:space="preserve"> </w:t>
+      </w:r>
+      <w:proofErr w:type="spellStart"/>
+      <w:r>
+        <w:rPr>
+          <w:rFonts w:asciiTheme="minorHAnsi" w:hAnsiTheme="minorHAnsi"/>
+        </w:rPr>
+        <w:t>elemanları</w:t>
+      </w:r>
+      <w:proofErr w:type="spellEnd"/>
+      <w:r>
+        <w:rPr>
+          <w:rFonts w:asciiTheme="minorHAnsi" w:hAnsiTheme="minorHAnsi"/>
+        </w:rPr>
+        <w:t xml:space="preserve">, </w:t>
+      </w:r>
+      <w:proofErr w:type="spellStart"/>
+      <w:r>
+        <w:rPr>
+          <w:rFonts w:asciiTheme="minorHAnsi" w:hAnsiTheme="minorHAnsi"/>
+        </w:rPr>
+        <w:t>olası</w:t>
+      </w:r>
+      <w:proofErr w:type="spellEnd"/>
+      <w:r>
+        <w:rPr>
+          <w:rFonts w:asciiTheme="minorHAnsi" w:hAnsiTheme="minorHAnsi"/>
+        </w:rPr>
+        <w:t xml:space="preserve"> </w:t>
+      </w:r>
+      <w:proofErr w:type="spellStart"/>
+      <w:r>
+        <w:rPr>
+          <w:rFonts w:asciiTheme="minorHAnsi" w:hAnsiTheme="minorHAnsi"/>
+        </w:rPr>
+        <w:t>yayıncılar</w:t>
+      </w:r>
+      <w:proofErr w:type="spellEnd"/>
+      <w:r>
+        <w:rPr>
+          <w:rFonts w:asciiTheme="minorHAnsi" w:hAnsiTheme="minorHAnsi"/>
+        </w:rPr>
+        <w:t xml:space="preserve"> </w:t>
+      </w:r>
+      <w:proofErr w:type="spellStart"/>
+      <w:r>
+        <w:rPr>
+          <w:rFonts w:asciiTheme="minorHAnsi" w:hAnsiTheme="minorHAnsi"/>
+        </w:rPr>
+        <w:t>ve</w:t>
+      </w:r>
+      <w:proofErr w:type="spellEnd"/>
+      <w:r>
+        <w:rPr>
+          <w:rFonts w:asciiTheme="minorHAnsi" w:hAnsiTheme="minorHAnsi"/>
+        </w:rPr>
+        <w:t xml:space="preserve"> </w:t>
+      </w:r>
+      <w:proofErr w:type="spellStart"/>
+      <w:r>
+        <w:rPr>
+          <w:rFonts w:asciiTheme="minorHAnsi" w:hAnsiTheme="minorHAnsi"/>
+        </w:rPr>
+        <w:t>oyun</w:t>
+      </w:r>
+      <w:proofErr w:type="spellEnd"/>
+      <w:r>
+        <w:rPr>
+          <w:rFonts w:asciiTheme="minorHAnsi" w:hAnsiTheme="minorHAnsi"/>
+        </w:rPr>
+        <w:t xml:space="preserve"> </w:t>
+      </w:r>
+      <w:proofErr w:type="spellStart"/>
+      <w:r>
+        <w:rPr>
+          <w:rFonts w:asciiTheme="minorHAnsi" w:hAnsiTheme="minorHAnsi"/>
+        </w:rPr>
+        <w:t>toplulukları</w:t>
+      </w:r>
+      <w:proofErr w:type="spellEnd"/>
+      <w:r>
+        <w:rPr>
+          <w:rFonts w:asciiTheme="minorHAnsi" w:hAnsiTheme="minorHAnsi"/>
+        </w:rPr>
+        <w:t xml:space="preserve"> d</w:t>
       </w:r>
       <w:r>
         <w:rPr>
@@ -563,7 +2574,63 @@
         <w:rPr>
           <w:rFonts w:asciiTheme="minorHAnsi" w:hAnsiTheme="minorHAnsi"/>
         </w:rPr>
-        <w:t xml:space="preserve"> potansiyel paydaşlar arasında değerlendirilmiştir.</w:t>
+        <w:t xml:space="preserve"> </w:t>
+      </w:r>
+      <w:proofErr w:type="spellStart"/>
+      <w:r>
+        <w:rPr>
+          <w:rFonts w:asciiTheme="minorHAnsi" w:hAnsiTheme="minorHAnsi"/>
+        </w:rPr>
+        <w:t>potansiyel</w:t>
+      </w:r>
+      <w:proofErr w:type="spellEnd"/>
+      <w:r>
+        <w:rPr>
+          <w:rFonts w:asciiTheme="minorHAnsi" w:hAnsiTheme="minorHAnsi"/>
+        </w:rPr>
+        <w:t xml:space="preserve"> </w:t>
+      </w:r>
+      <w:proofErr w:type="spellStart"/>
+      <w:r>
+        <w:rPr>
+          <w:rFonts w:asciiTheme="minorHAnsi" w:hAnsiTheme="minorHAnsi"/>
+        </w:rPr>
+        <w:t>paydaşlar</w:t>
+      </w:r>
+      <w:proofErr w:type="spellEnd"/>
+      <w:r>
+        <w:rPr>
+          <w:rFonts w:asciiTheme="minorHAnsi" w:hAnsiTheme="minorHAnsi"/>
+        </w:rPr>
+        <w:t xml:space="preserve"> </w:t>
+      </w:r>
+      <w:proofErr w:type="spellStart"/>
+      <w:r>
+        <w:rPr>
+          <w:rFonts w:asciiTheme="minorHAnsi" w:hAnsiTheme="minorHAnsi"/>
+        </w:rPr>
+        <w:t>arasında</w:t>
+      </w:r>
+      <w:proofErr w:type="spellEnd"/>
+      <w:r>
+        <w:rPr>
+          <w:rFonts w:asciiTheme="minorHAnsi" w:hAnsiTheme="minorHAnsi"/>
+        </w:rPr>
+        <w:t xml:space="preserve"> </w:t>
+      </w:r>
+      <w:proofErr w:type="spellStart"/>
+      <w:r>
+        <w:rPr>
+          <w:rFonts w:asciiTheme="minorHAnsi" w:hAnsiTheme="minorHAnsi"/>
+        </w:rPr>
+        <w:t>değerlendirilmiştir</w:t>
+      </w:r>
+      <w:proofErr w:type="spellEnd"/>
+      <w:r>
+        <w:rPr>
+          <w:rFonts w:asciiTheme="minorHAnsi" w:hAnsiTheme="minorHAnsi"/>
+        </w:rPr>
+        <w:t>.</w:t>
       </w:r>
     </w:p>
     <w:p>
@@ -582,7 +2649,105 @@
         <w:rPr>
           <w:rFonts w:asciiTheme="minorHAnsi" w:hAnsiTheme="minorHAnsi"/>
         </w:rPr>
-        <w:t>Bu hafta ayrıca proje vizyonu daha net hâle getirilmiştir.</w:t>
+        <w:t xml:space="preserve">Bu </w:t>
+      </w:r>
+      <w:proofErr w:type="spellStart"/>
+      <w:r>
+        <w:rPr>
+          <w:rFonts w:asciiTheme="minorHAnsi" w:hAnsiTheme="minorHAnsi"/>
+        </w:rPr>
+        <w:t>hafta</w:t>
+      </w:r>
+      <w:proofErr w:type="spellEnd"/>
+      <w:r>
+        <w:rPr>
+          <w:rFonts w:asciiTheme="minorHAnsi" w:hAnsiTheme="minorHAnsi"/>
+        </w:rPr>
+        <w:t xml:space="preserve"> </w:t>
+      </w:r>
+      <w:proofErr w:type="spellStart"/>
+      <w:r>
+        <w:rPr>
+          <w:rFonts w:asciiTheme="minorHAnsi" w:hAnsiTheme="minorHAnsi"/>
+        </w:rPr>
+        <w:t>ayrıca</w:t>
+      </w:r>
+      <w:proofErr w:type="spellEnd"/>
+      <w:r>
+        <w:rPr>
+          <w:rFonts w:asciiTheme="minorHAnsi" w:hAnsiTheme="minorHAnsi"/>
+        </w:rPr>
+        <w:t xml:space="preserve"> </w:t>
+      </w:r>
+      <w:proofErr w:type="spellStart"/>
+      <w:r>
+        <w:rPr>
+          <w:rFonts w:asciiTheme="minorHAnsi" w:hAnsiTheme="minorHAnsi"/>
+        </w:rPr>
+        <w:t>proje</w:t>
+      </w:r>
+      <w:proofErr w:type="spellEnd"/>
+      <w:r>
+        <w:rPr>
+          <w:rFonts w:asciiTheme="minorHAnsi" w:hAnsiTheme="minorHAnsi"/>
+        </w:rPr>
+        <w:t xml:space="preserve"> </w:t>
+      </w:r>
+      <w:proofErr w:type="spellStart"/>
+      <w:r>
+        <w:rPr>
+          <w:rFonts w:asciiTheme="minorHAnsi" w:hAnsiTheme="minorHAnsi"/>
+        </w:rPr>
+        <w:t>vizyonu</w:t>
+      </w:r>
+      <w:proofErr w:type="spellEnd"/>
+      <w:r>
+        <w:rPr>
+          <w:rFonts w:asciiTheme="minorHAnsi" w:hAnsiTheme="minorHAnsi"/>
+        </w:rPr>
+        <w:t xml:space="preserve"> </w:t>
+      </w:r>
+      <w:proofErr w:type="spellStart"/>
+      <w:r>
+        <w:rPr>
+          <w:rFonts w:asciiTheme="minorHAnsi" w:hAnsiTheme="minorHAnsi"/>
+        </w:rPr>
+        <w:t>daha</w:t>
+      </w:r>
+      <w:proofErr w:type="spellEnd"/>
+      <w:r>
+        <w:rPr>
+          <w:rFonts w:asciiTheme="minorHAnsi" w:hAnsiTheme="minorHAnsi"/>
+        </w:rPr>
+        <w:t xml:space="preserve"> net </w:t>
+      </w:r>
+      <w:proofErr w:type="spellStart"/>
+      <w:r>
+        <w:rPr>
+          <w:rFonts w:asciiTheme="minorHAnsi" w:hAnsiTheme="minorHAnsi"/>
+        </w:rPr>
+        <w:t>hâle</w:t>
+      </w:r>
+      <w:proofErr w:type="spellEnd"/>
+      <w:r>
+        <w:rPr>
+          <w:rFonts w:asciiTheme="minorHAnsi" w:hAnsiTheme="minorHAnsi"/>
+        </w:rPr>
+        <w:t xml:space="preserve"> </w:t>
+      </w:r>
+      <w:proofErr w:type="spellStart"/>
+      <w:r>
+        <w:rPr>
+          <w:rFonts w:asciiTheme="minorHAnsi" w:hAnsiTheme="minorHAnsi"/>
+        </w:rPr>
+        <w:t>getirilmiştir</w:t>
+      </w:r>
+      <w:proofErr w:type="spellEnd"/>
+      <w:r>
+        <w:rPr>
+          <w:rFonts w:asciiTheme="minorHAnsi" w:hAnsiTheme="minorHAnsi"/>
+        </w:rPr>
+        <w:t>.</w:t>
       </w:r>
     </w:p>
     <w:p>
@@ -595,6 +2760,7 @@
           <w:szCs w:val="28"/>
         </w:rPr>
       </w:pPr>
+      <w:proofErr w:type="spellStart"/>
       <w:r>
         <w:rPr>
           <w:b/>
@@ -603,42 +2769,19 @@
           <w:szCs w:val="28"/>
         </w:rPr>
         <w:lastRenderedPageBreak/>
-        <w:t>Karşılaşılan Zorluklar:</w:t>
-      </w:r>
-    </w:p>
-    <w:p>
-      <w:pPr>
-        <w:spacing w:after="120" w:line="278" w:lineRule="auto"/>
-      </w:pPr>
-      <w:r>
-        <w:t xml:space="preserve">    </w:t>
-      </w:r>
-      <w:r>
-        <w:t>Bu hafta karşılaşılan en önemli zorluk, ekip içi ortak geliştirme süreci için uygun sürüm kontrol yönteminin belirlenmesi olmuştur. Unity Version Control ile yapılan denemeler istenilen sonucu vermediği için alternatif çalışma düzenine geçilmiştir. Bunun yanında görevlerin ağırlıklandırılarak ekip üyelerine dengeli biçimde dağıtılma</w:t>
-      </w:r>
-      <w:r>
-        <w:t xml:space="preserve">sı işlemi </w:t>
-      </w:r>
-      <w:r>
-        <w:t>d</w:t>
-      </w:r>
-      <w:r>
-        <w:t>e zorlayıcı</w:t>
-      </w:r>
-      <w:r>
-        <w:t xml:space="preserve"> bir süreç olmuştur.</w:t>
-      </w:r>
-    </w:p>
-    <w:p>
-      <w:pPr>
-        <w:spacing w:after="120" w:line="278" w:lineRule="auto"/>
+        <w:t>Karşılaşılan</w:t>
+      </w:r>
+      <w:proofErr w:type="spellEnd"/>
+      <w:r>
         <w:rPr>
           <w:b/>
           <w:bCs/>
           <w:sz w:val="28"/>
           <w:szCs w:val="28"/>
         </w:rPr>
-      </w:pPr>
+        <w:t xml:space="preserve"> </w:t>
+      </w:r>
+      <w:proofErr w:type="spellStart"/>
       <w:r>
         <w:rPr>
           <w:b/>
@@ -646,7 +2789,604 @@
           <w:sz w:val="28"/>
           <w:szCs w:val="28"/>
         </w:rPr>
-        <w:t>Alınan Kararlar:</w:t>
+        <w:t>Zorluklar</w:t>
+      </w:r>
+      <w:proofErr w:type="spellEnd"/>
+      <w:r>
+        <w:rPr>
+          <w:b/>
+          <w:bCs/>
+          <w:sz w:val="28"/>
+          <w:szCs w:val="28"/>
+        </w:rPr>
+        <w:t>:</w:t>
+      </w:r>
+    </w:p>
+    <w:p>
+      <w:pPr>
+        <w:spacing w:after="120" w:line="278" w:lineRule="auto"/>
+      </w:pPr>
+      <w:r>
+        <w:t xml:space="preserve">    </w:t>
+      </w:r>
+      <w:r>
+        <w:t xml:space="preserve">Bu </w:t>
+      </w:r>
+      <w:proofErr w:type="spellStart"/>
+      <w:r>
+        <w:t>hafta</w:t>
+      </w:r>
+      <w:proofErr w:type="spellEnd"/>
+      <w:r>
+        <w:t xml:space="preserve"> </w:t>
+      </w:r>
+      <w:proofErr w:type="spellStart"/>
+      <w:r>
+        <w:t>karşılaşılan</w:t>
+      </w:r>
+      <w:proofErr w:type="spellEnd"/>
+      <w:r>
+        <w:t xml:space="preserve"> </w:t>
+      </w:r>
+      <w:proofErr w:type="spellStart"/>
+      <w:r>
+        <w:t>en</w:t>
+      </w:r>
+      <w:proofErr w:type="spellEnd"/>
+      <w:r>
+        <w:t xml:space="preserve"> </w:t>
+      </w:r>
+      <w:proofErr w:type="spellStart"/>
+      <w:r>
+        <w:t>önemli</w:t>
+      </w:r>
+      <w:proofErr w:type="spellEnd"/>
+      <w:r>
+        <w:t xml:space="preserve"> </w:t>
+      </w:r>
+      <w:proofErr w:type="spellStart"/>
+      <w:r>
+        <w:t>zorluk</w:t>
+      </w:r>
+      <w:proofErr w:type="spellEnd"/>
+      <w:r>
+        <w:t xml:space="preserve">, </w:t>
+      </w:r>
+      <w:proofErr w:type="spellStart"/>
+      <w:r>
+        <w:t>ekip</w:t>
+      </w:r>
+      <w:proofErr w:type="spellEnd"/>
+      <w:r>
+        <w:t xml:space="preserve"> </w:t>
+      </w:r>
+      <w:proofErr w:type="spellStart"/>
+      <w:r>
+        <w:t>içi</w:t>
+      </w:r>
+      <w:proofErr w:type="spellEnd"/>
+      <w:r>
+        <w:t xml:space="preserve"> </w:t>
+      </w:r>
+      <w:proofErr w:type="spellStart"/>
+      <w:r>
+        <w:t>ortak</w:t>
+      </w:r>
+      <w:proofErr w:type="spellEnd"/>
+      <w:r>
+        <w:t xml:space="preserve"> </w:t>
+      </w:r>
+      <w:proofErr w:type="spellStart"/>
+      <w:r>
+        <w:t>geliştirme</w:t>
+      </w:r>
+      <w:proofErr w:type="spellEnd"/>
+      <w:r>
+        <w:t xml:space="preserve"> </w:t>
+      </w:r>
+      <w:proofErr w:type="spellStart"/>
+      <w:r>
+        <w:t>süreci</w:t>
+      </w:r>
+      <w:proofErr w:type="spellEnd"/>
+      <w:r>
+        <w:t xml:space="preserve"> </w:t>
+      </w:r>
+      <w:proofErr w:type="spellStart"/>
+      <w:r>
+        <w:t>için</w:t>
+      </w:r>
+      <w:proofErr w:type="spellEnd"/>
+      <w:r>
+        <w:t xml:space="preserve"> </w:t>
+      </w:r>
+      <w:proofErr w:type="spellStart"/>
+      <w:r>
+        <w:t>uygun</w:t>
+      </w:r>
+      <w:proofErr w:type="spellEnd"/>
+      <w:r>
+        <w:t xml:space="preserve"> </w:t>
+      </w:r>
+      <w:proofErr w:type="spellStart"/>
+      <w:r>
+        <w:t>sürüm</w:t>
+      </w:r>
+      <w:proofErr w:type="spellEnd"/>
+      <w:r>
+        <w:t xml:space="preserve"> </w:t>
+      </w:r>
+      <w:proofErr w:type="spellStart"/>
+      <w:r>
+        <w:t>kontrol</w:t>
+      </w:r>
+      <w:proofErr w:type="spellEnd"/>
+      <w:r>
+        <w:t xml:space="preserve"> </w:t>
+      </w:r>
+      <w:proofErr w:type="spellStart"/>
+      <w:r>
+        <w:t>yönteminin</w:t>
+      </w:r>
+      <w:proofErr w:type="spellEnd"/>
+      <w:r>
+        <w:t xml:space="preserve"> </w:t>
+      </w:r>
+      <w:proofErr w:type="spellStart"/>
+      <w:r>
+        <w:t>belirlenmesi</w:t>
+      </w:r>
+      <w:proofErr w:type="spellEnd"/>
+      <w:r>
+        <w:t xml:space="preserve"> </w:t>
+      </w:r>
+      <w:proofErr w:type="spellStart"/>
+      <w:r>
+        <w:t>olmuştur</w:t>
+      </w:r>
+      <w:proofErr w:type="spellEnd"/>
+      <w:r>
+        <w:t xml:space="preserve">. Unity Version Control </w:t>
+      </w:r>
+      <w:proofErr w:type="spellStart"/>
+      <w:r>
+        <w:t>ile</w:t>
+      </w:r>
+      <w:proofErr w:type="spellEnd"/>
+      <w:r>
+        <w:t xml:space="preserve"> </w:t>
+      </w:r>
+      <w:proofErr w:type="spellStart"/>
+      <w:r>
+        <w:t>yapılan</w:t>
+      </w:r>
+      <w:proofErr w:type="spellEnd"/>
+      <w:r>
+        <w:t xml:space="preserve"> </w:t>
+      </w:r>
+      <w:proofErr w:type="spellStart"/>
+      <w:r>
+        <w:t>denemeler</w:t>
+      </w:r>
+      <w:proofErr w:type="spellEnd"/>
+      <w:r>
+        <w:t xml:space="preserve"> </w:t>
+      </w:r>
+      <w:proofErr w:type="spellStart"/>
+      <w:r>
+        <w:t>istenilen</w:t>
+      </w:r>
+      <w:proofErr w:type="spellEnd"/>
+      <w:r>
+        <w:t xml:space="preserve"> </w:t>
+      </w:r>
+      <w:proofErr w:type="spellStart"/>
+      <w:r>
+        <w:t>sonucu</w:t>
+      </w:r>
+      <w:proofErr w:type="spellEnd"/>
+      <w:r>
+        <w:t xml:space="preserve"> </w:t>
+      </w:r>
+      <w:proofErr w:type="spellStart"/>
+      <w:r>
+        <w:t>vermediği</w:t>
+      </w:r>
+      <w:proofErr w:type="spellEnd"/>
+      <w:r>
+        <w:t xml:space="preserve"> </w:t>
+      </w:r>
+      <w:proofErr w:type="spellStart"/>
+      <w:r>
+        <w:t>için</w:t>
+      </w:r>
+      <w:proofErr w:type="spellEnd"/>
+      <w:r>
+        <w:t xml:space="preserve"> </w:t>
+      </w:r>
+      <w:proofErr w:type="spellStart"/>
+      <w:r>
+        <w:t>alternatif</w:t>
+      </w:r>
+      <w:proofErr w:type="spellEnd"/>
+      <w:r>
+        <w:t xml:space="preserve"> </w:t>
+      </w:r>
+      <w:proofErr w:type="spellStart"/>
+      <w:r>
+        <w:t>çalışma</w:t>
+      </w:r>
+      <w:proofErr w:type="spellEnd"/>
+      <w:r>
+        <w:t xml:space="preserve"> </w:t>
+      </w:r>
+      <w:proofErr w:type="spellStart"/>
+      <w:r>
+        <w:t>düzenine</w:t>
+      </w:r>
+      <w:proofErr w:type="spellEnd"/>
+      <w:r>
+        <w:t xml:space="preserve"> </w:t>
+      </w:r>
+      <w:proofErr w:type="spellStart"/>
+      <w:r>
+        <w:t>geçilmiştir</w:t>
+      </w:r>
+      <w:proofErr w:type="spellEnd"/>
+      <w:r>
+        <w:t xml:space="preserve">. </w:t>
+      </w:r>
+      <w:proofErr w:type="spellStart"/>
+      <w:r>
+        <w:t>Ayrıca</w:t>
+      </w:r>
+      <w:proofErr w:type="spellEnd"/>
+      <w:r>
+        <w:t xml:space="preserve"> Tuna </w:t>
+      </w:r>
+      <w:proofErr w:type="spellStart"/>
+      <w:r>
+        <w:t>laboratuvar</w:t>
+      </w:r>
+      <w:proofErr w:type="spellEnd"/>
+      <w:r>
+        <w:t xml:space="preserve"> </w:t>
+      </w:r>
+      <w:proofErr w:type="spellStart"/>
+      <w:r>
+        <w:t>toplantısı</w:t>
+      </w:r>
+      <w:proofErr w:type="spellEnd"/>
+      <w:r>
+        <w:t xml:space="preserve"> </w:t>
+      </w:r>
+      <w:proofErr w:type="spellStart"/>
+      <w:r>
+        <w:t>sırasında</w:t>
+      </w:r>
+      <w:proofErr w:type="spellEnd"/>
+      <w:r>
+        <w:t xml:space="preserve"> </w:t>
+      </w:r>
+      <w:proofErr w:type="spellStart"/>
+      <w:r>
+        <w:t>laboratuvar</w:t>
+      </w:r>
+      <w:proofErr w:type="spellEnd"/>
+      <w:r>
+        <w:t xml:space="preserve"> </w:t>
+      </w:r>
+      <w:proofErr w:type="spellStart"/>
+      <w:r>
+        <w:t>sınıfı</w:t>
+      </w:r>
+      <w:proofErr w:type="spellEnd"/>
+      <w:r>
+        <w:t xml:space="preserve"> </w:t>
+      </w:r>
+      <w:proofErr w:type="spellStart"/>
+      <w:r>
+        <w:t>olan</w:t>
+      </w:r>
+      <w:proofErr w:type="spellEnd"/>
+      <w:r>
+        <w:t xml:space="preserve"> MZ-08’in </w:t>
+      </w:r>
+      <w:proofErr w:type="spellStart"/>
+      <w:r>
+        <w:t>arka</w:t>
+      </w:r>
+      <w:proofErr w:type="spellEnd"/>
+      <w:r>
+        <w:t xml:space="preserve"> </w:t>
+      </w:r>
+      <w:proofErr w:type="spellStart"/>
+      <w:r>
+        <w:t>tarafında</w:t>
+      </w:r>
+      <w:proofErr w:type="spellEnd"/>
+      <w:r>
+        <w:t xml:space="preserve"> </w:t>
+      </w:r>
+      <w:proofErr w:type="spellStart"/>
+      <w:r>
+        <w:t>neden</w:t>
+      </w:r>
+      <w:proofErr w:type="spellEnd"/>
+      <w:r>
+        <w:t xml:space="preserve"> </w:t>
+      </w:r>
+      <w:proofErr w:type="spellStart"/>
+      <w:r>
+        <w:t>olduğu</w:t>
+      </w:r>
+      <w:proofErr w:type="spellEnd"/>
+      <w:r>
+        <w:t xml:space="preserve"> </w:t>
+      </w:r>
+      <w:proofErr w:type="spellStart"/>
+      <w:r>
+        <w:t>anlaşılamayan</w:t>
+      </w:r>
+      <w:proofErr w:type="spellEnd"/>
+      <w:r>
+        <w:t xml:space="preserve"> </w:t>
+      </w:r>
+      <w:proofErr w:type="spellStart"/>
+      <w:r>
+        <w:t>bir</w:t>
+      </w:r>
+      <w:proofErr w:type="spellEnd"/>
+      <w:r>
+        <w:t xml:space="preserve"> </w:t>
+      </w:r>
+      <w:proofErr w:type="spellStart"/>
+      <w:r>
+        <w:t>alçaltıya</w:t>
+      </w:r>
+      <w:proofErr w:type="spellEnd"/>
+      <w:r>
+        <w:t xml:space="preserve"> </w:t>
+      </w:r>
+      <w:proofErr w:type="spellStart"/>
+      <w:r>
+        <w:t>kafasını</w:t>
+      </w:r>
+      <w:proofErr w:type="spellEnd"/>
+      <w:r>
+        <w:t xml:space="preserve"> </w:t>
+      </w:r>
+      <w:proofErr w:type="spellStart"/>
+      <w:r>
+        <w:t>vurdu</w:t>
+      </w:r>
+      <w:proofErr w:type="spellEnd"/>
+      <w:r>
+        <w:t xml:space="preserve"> </w:t>
+      </w:r>
+      <w:proofErr w:type="spellStart"/>
+      <w:r>
+        <w:t>ve</w:t>
+      </w:r>
+      <w:proofErr w:type="spellEnd"/>
+      <w:r>
+        <w:t xml:space="preserve"> </w:t>
+      </w:r>
+      <w:proofErr w:type="spellStart"/>
+      <w:r>
+        <w:t>buz</w:t>
+      </w:r>
+      <w:proofErr w:type="spellEnd"/>
+      <w:r>
+        <w:t xml:space="preserve"> </w:t>
+      </w:r>
+      <w:proofErr w:type="spellStart"/>
+      <w:r>
+        <w:t>bulunamadığından</w:t>
+      </w:r>
+      <w:proofErr w:type="spellEnd"/>
+      <w:r>
+        <w:t xml:space="preserve"> </w:t>
+      </w:r>
+      <w:proofErr w:type="spellStart"/>
+      <w:r>
+        <w:t>kafasında</w:t>
+      </w:r>
+      <w:proofErr w:type="spellEnd"/>
+      <w:r>
+        <w:t xml:space="preserve"> </w:t>
+      </w:r>
+      <w:proofErr w:type="spellStart"/>
+      <w:r>
+        <w:t>şiş</w:t>
+      </w:r>
+      <w:r>
+        <w:t>l</w:t>
+      </w:r>
+      <w:r>
+        <w:t>ik</w:t>
+      </w:r>
+      <w:proofErr w:type="spellEnd"/>
+      <w:r>
+        <w:t xml:space="preserve"> </w:t>
+      </w:r>
+      <w:proofErr w:type="spellStart"/>
+      <w:r>
+        <w:t>oluştu</w:t>
+      </w:r>
+      <w:proofErr w:type="spellEnd"/>
+      <w:r>
+        <w:t xml:space="preserve">. </w:t>
+      </w:r>
+      <w:r>
+        <w:t xml:space="preserve">Bunun </w:t>
+      </w:r>
+      <w:proofErr w:type="spellStart"/>
+      <w:r>
+        <w:t>yanında</w:t>
+      </w:r>
+      <w:proofErr w:type="spellEnd"/>
+      <w:r>
+        <w:t xml:space="preserve"> </w:t>
+      </w:r>
+      <w:proofErr w:type="spellStart"/>
+      <w:r>
+        <w:t>görevlerin</w:t>
+      </w:r>
+      <w:proofErr w:type="spellEnd"/>
+      <w:r>
+        <w:t xml:space="preserve"> </w:t>
+      </w:r>
+      <w:proofErr w:type="spellStart"/>
+      <w:r>
+        <w:t>ağırlıklandırılarak</w:t>
+      </w:r>
+      <w:proofErr w:type="spellEnd"/>
+      <w:r>
+        <w:t xml:space="preserve"> </w:t>
+      </w:r>
+      <w:proofErr w:type="spellStart"/>
+      <w:r>
+        <w:t>ekip</w:t>
+      </w:r>
+      <w:proofErr w:type="spellEnd"/>
+      <w:r>
+        <w:t xml:space="preserve"> </w:t>
+      </w:r>
+      <w:proofErr w:type="spellStart"/>
+      <w:r>
+        <w:t>üyelerine</w:t>
+      </w:r>
+      <w:proofErr w:type="spellEnd"/>
+      <w:r>
+        <w:t xml:space="preserve"> </w:t>
+      </w:r>
+      <w:proofErr w:type="spellStart"/>
+      <w:r>
+        <w:t>dengeli</w:t>
+      </w:r>
+      <w:proofErr w:type="spellEnd"/>
+      <w:r>
+        <w:t xml:space="preserve"> </w:t>
+      </w:r>
+      <w:proofErr w:type="spellStart"/>
+      <w:r>
+        <w:t>biçimde</w:t>
+      </w:r>
+      <w:proofErr w:type="spellEnd"/>
+      <w:r>
+        <w:t xml:space="preserve"> </w:t>
+      </w:r>
+      <w:proofErr w:type="spellStart"/>
+      <w:r>
+        <w:t>dağıtılma</w:t>
+      </w:r>
+      <w:r>
+        <w:t>sı</w:t>
+      </w:r>
+      <w:proofErr w:type="spellEnd"/>
+      <w:r>
+        <w:t xml:space="preserve"> </w:t>
+      </w:r>
+      <w:proofErr w:type="spellStart"/>
+      <w:r>
+        <w:t>işlemi</w:t>
+      </w:r>
+      <w:proofErr w:type="spellEnd"/>
+      <w:r>
+        <w:t xml:space="preserve"> </w:t>
+      </w:r>
+      <w:r>
+        <w:t>d</w:t>
+      </w:r>
+      <w:r>
+        <w:t xml:space="preserve">e </w:t>
+      </w:r>
+      <w:proofErr w:type="spellStart"/>
+      <w:r>
+        <w:t>zorlayıcı</w:t>
+      </w:r>
+      <w:proofErr w:type="spellEnd"/>
+      <w:r>
+        <w:t xml:space="preserve"> </w:t>
+      </w:r>
+      <w:proofErr w:type="spellStart"/>
+      <w:r>
+        <w:t>bir</w:t>
+      </w:r>
+      <w:proofErr w:type="spellEnd"/>
+      <w:r>
+        <w:t xml:space="preserve"> </w:t>
+      </w:r>
+      <w:proofErr w:type="spellStart"/>
+      <w:r>
+        <w:t>süreç</w:t>
+      </w:r>
+      <w:proofErr w:type="spellEnd"/>
+      <w:r>
+        <w:t xml:space="preserve"> </w:t>
+      </w:r>
+      <w:proofErr w:type="spellStart"/>
+      <w:r>
+        <w:t>olmuştur</w:t>
+      </w:r>
+      <w:proofErr w:type="spellEnd"/>
+      <w:r>
+        <w:t>.</w:t>
+      </w:r>
+      <w:r>
+        <w:t xml:space="preserve"> </w:t>
+      </w:r>
+    </w:p>
+    <w:p>
+      <w:pPr>
+        <w:spacing w:after="120" w:line="278" w:lineRule="auto"/>
+        <w:rPr>
+          <w:b/>
+          <w:bCs/>
+          <w:sz w:val="28"/>
+          <w:szCs w:val="28"/>
+        </w:rPr>
+      </w:pPr>
+      <w:proofErr w:type="spellStart"/>
+      <w:r>
+        <w:rPr>
+          <w:b/>
+          <w:bCs/>
+          <w:sz w:val="28"/>
+          <w:szCs w:val="28"/>
+        </w:rPr>
+        <w:t>Alınan</w:t>
+      </w:r>
+      <w:proofErr w:type="spellEnd"/>
+      <w:r>
+        <w:rPr>
+          <w:b/>
+          <w:bCs/>
+          <w:sz w:val="28"/>
+          <w:szCs w:val="28"/>
+        </w:rPr>
+        <w:t xml:space="preserve"> </w:t>
+      </w:r>
+      <w:proofErr w:type="spellStart"/>
+      <w:r>
+        <w:rPr>
+          <w:b/>
+          <w:bCs/>
+          <w:sz w:val="28"/>
+          <w:szCs w:val="28"/>
+        </w:rPr>
+        <w:t>Kararlar</w:t>
+      </w:r>
+      <w:proofErr w:type="spellEnd"/>
+      <w:r>
+        <w:rPr>
+          <w:b/>
+          <w:bCs/>
+          <w:sz w:val="28"/>
+          <w:szCs w:val="28"/>
+        </w:rPr>
+        <w:t>:</w:t>
       </w:r>
     </w:p>
     <w:p>
@@ -659,7 +3399,71 @@
         <w:spacing w:after="120" w:line="278" w:lineRule="auto"/>
       </w:pPr>
       <w:r>
-        <w:t xml:space="preserve">Bu hafta sonunda proje yönetiminin GitHub üzerinden yürütülmesine karar verilmiştir. </w:t>
+        <w:t xml:space="preserve">Bu </w:t>
+      </w:r>
+      <w:proofErr w:type="spellStart"/>
+      <w:r>
+        <w:t>hafta</w:t>
+      </w:r>
+      <w:proofErr w:type="spellEnd"/>
+      <w:r>
+        <w:t xml:space="preserve"> </w:t>
+      </w:r>
+      <w:proofErr w:type="spellStart"/>
+      <w:r>
+        <w:t>sonunda</w:t>
+      </w:r>
+      <w:proofErr w:type="spellEnd"/>
+      <w:r>
+        <w:t xml:space="preserve"> </w:t>
+      </w:r>
+      <w:proofErr w:type="spellStart"/>
+      <w:r>
+        <w:t>proje</w:t>
+      </w:r>
+      <w:proofErr w:type="spellEnd"/>
+      <w:r>
+        <w:t xml:space="preserve"> </w:t>
+      </w:r>
+      <w:proofErr w:type="spellStart"/>
+      <w:r>
+        <w:t>yönetiminin</w:t>
+      </w:r>
+      <w:proofErr w:type="spellEnd"/>
+      <w:r>
+        <w:t xml:space="preserve"> GitHub </w:t>
+      </w:r>
+      <w:proofErr w:type="spellStart"/>
+      <w:r>
+        <w:t>üzerinden</w:t>
+      </w:r>
+      <w:proofErr w:type="spellEnd"/>
+      <w:r>
+        <w:t xml:space="preserve"> </w:t>
+      </w:r>
+      <w:proofErr w:type="spellStart"/>
+      <w:r>
+        <w:t>yürütülmesine</w:t>
+      </w:r>
+      <w:proofErr w:type="spellEnd"/>
+      <w:r>
+        <w:t xml:space="preserve"> </w:t>
+      </w:r>
+      <w:proofErr w:type="spellStart"/>
+      <w:r>
+        <w:t>karar</w:t>
+      </w:r>
+      <w:proofErr w:type="spellEnd"/>
+      <w:r>
+        <w:t xml:space="preserve"> </w:t>
+      </w:r>
+      <w:proofErr w:type="spellStart"/>
+      <w:r>
+        <w:t>verilmiştir</w:t>
+      </w:r>
+      <w:proofErr w:type="spellEnd"/>
+      <w:r>
+        <w:t xml:space="preserve">. </w:t>
       </w:r>
     </w:p>
     <w:p>
@@ -677,6 +3481,7 @@
           <w:bCs w:val="0"/>
         </w:rPr>
       </w:pPr>
+      <w:proofErr w:type="spellStart"/>
       <w:r>
         <w:rPr>
           <w:rStyle w:val="Gl"/>
@@ -684,7 +3489,37 @@
           <w:b w:val="0"/>
           <w:bCs w:val="0"/>
         </w:rPr>
-        <w:t>Projenin vizyonu:</w:t>
+        <w:t>Projenin</w:t>
+      </w:r>
+      <w:proofErr w:type="spellEnd"/>
+      <w:r>
+        <w:rPr>
+          <w:rStyle w:val="Gl"/>
+          <w:rFonts w:asciiTheme="minorHAnsi" w:eastAsiaTheme="majorEastAsia" w:hAnsiTheme="minorHAnsi"/>
+          <w:b w:val="0"/>
+          <w:bCs w:val="0"/>
+        </w:rPr>
+        <w:t xml:space="preserve"> </w:t>
+      </w:r>
+      <w:proofErr w:type="spellStart"/>
+      <w:r>
+        <w:rPr>
+          <w:rStyle w:val="Gl"/>
+          <w:rFonts w:asciiTheme="minorHAnsi" w:eastAsiaTheme="majorEastAsia" w:hAnsiTheme="minorHAnsi"/>
+          <w:b w:val="0"/>
+          <w:bCs w:val="0"/>
+        </w:rPr>
+        <w:t>vizyonu</w:t>
+      </w:r>
+      <w:proofErr w:type="spellEnd"/>
+      <w:r>
+        <w:rPr>
+          <w:rStyle w:val="Gl"/>
+          <w:rFonts w:asciiTheme="minorHAnsi" w:eastAsiaTheme="majorEastAsia" w:hAnsiTheme="minorHAnsi"/>
+          <w:b w:val="0"/>
+          <w:bCs w:val="0"/>
+        </w:rPr>
+        <w:t>:</w:t>
       </w:r>
       <w:r>
         <w:rPr>
@@ -711,21 +3546,727 @@
           <w:rStyle w:val="Gl"/>
           <w:rFonts w:asciiTheme="minorHAnsi" w:eastAsiaTheme="majorEastAsia" w:hAnsiTheme="minorHAnsi"/>
         </w:rPr>
-        <w:t xml:space="preserve">“Yunan mitolojisinin farklı oyun kültürlerinin harmanlanması ile </w:t>
-      </w:r>
-      <w:r>
-        <w:rPr>
-          <w:rStyle w:val="Gl"/>
-          <w:rFonts w:asciiTheme="minorHAnsi" w:eastAsiaTheme="majorEastAsia" w:hAnsiTheme="minorHAnsi"/>
-        </w:rPr>
-        <w:t xml:space="preserve">tüm oyunseverler için </w:t>
-      </w:r>
-      <w:r>
-        <w:rPr>
-          <w:rStyle w:val="Gl"/>
-          <w:rFonts w:asciiTheme="minorHAnsi" w:eastAsiaTheme="majorEastAsia" w:hAnsiTheme="minorHAnsi"/>
-        </w:rPr>
-        <w:t>büyük bir fırsat olan [oyunumuzun ismi belli değil] bir roguelite bullet hell tarzı oyundur. Tüm oyuncu kitlesine eğlenceli vakit geçirme avantajı sağlayan, bu tarz oyunlardan farklı olarak tek bir içeriğe odaklanmadan farklı içerikleri birleştirerek oyunculara benzersiz bir deneyim sunar.”</w:t>
+        <w:t xml:space="preserve">“Yunan </w:t>
+      </w:r>
+      <w:proofErr w:type="spellStart"/>
+      <w:r>
+        <w:rPr>
+          <w:rStyle w:val="Gl"/>
+          <w:rFonts w:asciiTheme="minorHAnsi" w:eastAsiaTheme="majorEastAsia" w:hAnsiTheme="minorHAnsi"/>
+        </w:rPr>
+        <w:t>mitolojisinin</w:t>
+      </w:r>
+      <w:proofErr w:type="spellEnd"/>
+      <w:r>
+        <w:rPr>
+          <w:rStyle w:val="Gl"/>
+          <w:rFonts w:asciiTheme="minorHAnsi" w:eastAsiaTheme="majorEastAsia" w:hAnsiTheme="minorHAnsi"/>
+        </w:rPr>
+        <w:t xml:space="preserve"> </w:t>
+      </w:r>
+      <w:proofErr w:type="spellStart"/>
+      <w:r>
+        <w:rPr>
+          <w:rStyle w:val="Gl"/>
+          <w:rFonts w:asciiTheme="minorHAnsi" w:eastAsiaTheme="majorEastAsia" w:hAnsiTheme="minorHAnsi"/>
+        </w:rPr>
+        <w:t>farklı</w:t>
+      </w:r>
+      <w:proofErr w:type="spellEnd"/>
+      <w:r>
+        <w:rPr>
+          <w:rStyle w:val="Gl"/>
+          <w:rFonts w:asciiTheme="minorHAnsi" w:eastAsiaTheme="majorEastAsia" w:hAnsiTheme="minorHAnsi"/>
+        </w:rPr>
+        <w:t xml:space="preserve"> </w:t>
+      </w:r>
+      <w:proofErr w:type="spellStart"/>
+      <w:r>
+        <w:rPr>
+          <w:rStyle w:val="Gl"/>
+          <w:rFonts w:asciiTheme="minorHAnsi" w:eastAsiaTheme="majorEastAsia" w:hAnsiTheme="minorHAnsi"/>
+        </w:rPr>
+        <w:t>oyun</w:t>
+      </w:r>
+      <w:proofErr w:type="spellEnd"/>
+      <w:r>
+        <w:rPr>
+          <w:rStyle w:val="Gl"/>
+          <w:rFonts w:asciiTheme="minorHAnsi" w:eastAsiaTheme="majorEastAsia" w:hAnsiTheme="minorHAnsi"/>
+        </w:rPr>
+        <w:t xml:space="preserve"> </w:t>
+      </w:r>
+      <w:proofErr w:type="spellStart"/>
+      <w:r>
+        <w:rPr>
+          <w:rStyle w:val="Gl"/>
+          <w:rFonts w:asciiTheme="minorHAnsi" w:eastAsiaTheme="majorEastAsia" w:hAnsiTheme="minorHAnsi"/>
+        </w:rPr>
+        <w:t>kültürlerinin</w:t>
+      </w:r>
+      <w:proofErr w:type="spellEnd"/>
+      <w:r>
+        <w:rPr>
+          <w:rStyle w:val="Gl"/>
+          <w:rFonts w:asciiTheme="minorHAnsi" w:eastAsiaTheme="majorEastAsia" w:hAnsiTheme="minorHAnsi"/>
+        </w:rPr>
+        <w:t xml:space="preserve"> </w:t>
+      </w:r>
+      <w:proofErr w:type="spellStart"/>
+      <w:r>
+        <w:rPr>
+          <w:rStyle w:val="Gl"/>
+          <w:rFonts w:asciiTheme="minorHAnsi" w:eastAsiaTheme="majorEastAsia" w:hAnsiTheme="minorHAnsi"/>
+        </w:rPr>
+        <w:t>harmanlanması</w:t>
+      </w:r>
+      <w:proofErr w:type="spellEnd"/>
+      <w:r>
+        <w:rPr>
+          <w:rStyle w:val="Gl"/>
+          <w:rFonts w:asciiTheme="minorHAnsi" w:eastAsiaTheme="majorEastAsia" w:hAnsiTheme="minorHAnsi"/>
+        </w:rPr>
+        <w:t xml:space="preserve"> </w:t>
+      </w:r>
+      <w:proofErr w:type="spellStart"/>
+      <w:r>
+        <w:rPr>
+          <w:rStyle w:val="Gl"/>
+          <w:rFonts w:asciiTheme="minorHAnsi" w:eastAsiaTheme="majorEastAsia" w:hAnsiTheme="minorHAnsi"/>
+        </w:rPr>
+        <w:t>ile</w:t>
+      </w:r>
+      <w:proofErr w:type="spellEnd"/>
+      <w:r>
+        <w:rPr>
+          <w:rStyle w:val="Gl"/>
+          <w:rFonts w:asciiTheme="minorHAnsi" w:eastAsiaTheme="majorEastAsia" w:hAnsiTheme="minorHAnsi"/>
+        </w:rPr>
+        <w:t xml:space="preserve"> </w:t>
+      </w:r>
+      <w:proofErr w:type="spellStart"/>
+      <w:r>
+        <w:rPr>
+          <w:rStyle w:val="Gl"/>
+          <w:rFonts w:asciiTheme="minorHAnsi" w:eastAsiaTheme="majorEastAsia" w:hAnsiTheme="minorHAnsi"/>
+        </w:rPr>
+        <w:t>tüm</w:t>
+      </w:r>
+      <w:proofErr w:type="spellEnd"/>
+      <w:r>
+        <w:rPr>
+          <w:rStyle w:val="Gl"/>
+          <w:rFonts w:asciiTheme="minorHAnsi" w:eastAsiaTheme="majorEastAsia" w:hAnsiTheme="minorHAnsi"/>
+        </w:rPr>
+        <w:t xml:space="preserve"> </w:t>
+      </w:r>
+      <w:proofErr w:type="spellStart"/>
+      <w:r>
+        <w:rPr>
+          <w:rStyle w:val="Gl"/>
+          <w:rFonts w:asciiTheme="minorHAnsi" w:eastAsiaTheme="majorEastAsia" w:hAnsiTheme="minorHAnsi"/>
+        </w:rPr>
+        <w:t>oyunseverler</w:t>
+      </w:r>
+      <w:proofErr w:type="spellEnd"/>
+      <w:r>
+        <w:rPr>
+          <w:rStyle w:val="Gl"/>
+          <w:rFonts w:asciiTheme="minorHAnsi" w:eastAsiaTheme="majorEastAsia" w:hAnsiTheme="minorHAnsi"/>
+        </w:rPr>
+        <w:t xml:space="preserve"> </w:t>
+      </w:r>
+      <w:proofErr w:type="spellStart"/>
+      <w:r>
+        <w:rPr>
+          <w:rStyle w:val="Gl"/>
+          <w:rFonts w:asciiTheme="minorHAnsi" w:eastAsiaTheme="majorEastAsia" w:hAnsiTheme="minorHAnsi"/>
+        </w:rPr>
+        <w:t>için</w:t>
+      </w:r>
+      <w:proofErr w:type="spellEnd"/>
+      <w:r>
+        <w:rPr>
+          <w:rStyle w:val="Gl"/>
+          <w:rFonts w:asciiTheme="minorHAnsi" w:eastAsiaTheme="majorEastAsia" w:hAnsiTheme="minorHAnsi"/>
+        </w:rPr>
+        <w:t xml:space="preserve"> </w:t>
+      </w:r>
+      <w:proofErr w:type="spellStart"/>
+      <w:r>
+        <w:rPr>
+          <w:rStyle w:val="Gl"/>
+          <w:rFonts w:asciiTheme="minorHAnsi" w:eastAsiaTheme="majorEastAsia" w:hAnsiTheme="minorHAnsi"/>
+        </w:rPr>
+        <w:t>büyük</w:t>
+      </w:r>
+      <w:proofErr w:type="spellEnd"/>
+      <w:r>
+        <w:rPr>
+          <w:rStyle w:val="Gl"/>
+          <w:rFonts w:asciiTheme="minorHAnsi" w:eastAsiaTheme="majorEastAsia" w:hAnsiTheme="minorHAnsi"/>
+        </w:rPr>
+        <w:t xml:space="preserve"> </w:t>
+      </w:r>
+      <w:proofErr w:type="spellStart"/>
+      <w:r>
+        <w:rPr>
+          <w:rStyle w:val="Gl"/>
+          <w:rFonts w:asciiTheme="minorHAnsi" w:eastAsiaTheme="majorEastAsia" w:hAnsiTheme="minorHAnsi"/>
+        </w:rPr>
+        <w:t>bir</w:t>
+      </w:r>
+      <w:proofErr w:type="spellEnd"/>
+      <w:r>
+        <w:rPr>
+          <w:rStyle w:val="Gl"/>
+          <w:rFonts w:asciiTheme="minorHAnsi" w:eastAsiaTheme="majorEastAsia" w:hAnsiTheme="minorHAnsi"/>
+        </w:rPr>
+        <w:t xml:space="preserve"> </w:t>
+      </w:r>
+      <w:proofErr w:type="spellStart"/>
+      <w:r>
+        <w:rPr>
+          <w:rStyle w:val="Gl"/>
+          <w:rFonts w:asciiTheme="minorHAnsi" w:eastAsiaTheme="majorEastAsia" w:hAnsiTheme="minorHAnsi"/>
+        </w:rPr>
+        <w:t>fırsat</w:t>
+      </w:r>
+      <w:proofErr w:type="spellEnd"/>
+      <w:r>
+        <w:rPr>
+          <w:rStyle w:val="Gl"/>
+          <w:rFonts w:asciiTheme="minorHAnsi" w:eastAsiaTheme="majorEastAsia" w:hAnsiTheme="minorHAnsi"/>
+        </w:rPr>
+        <w:t xml:space="preserve"> </w:t>
+      </w:r>
+      <w:proofErr w:type="spellStart"/>
+      <w:r>
+        <w:rPr>
+          <w:rStyle w:val="Gl"/>
+          <w:rFonts w:asciiTheme="minorHAnsi" w:eastAsiaTheme="majorEastAsia" w:hAnsiTheme="minorHAnsi"/>
+        </w:rPr>
+        <w:t>olan</w:t>
+      </w:r>
+      <w:proofErr w:type="spellEnd"/>
+      <w:r>
+        <w:rPr>
+          <w:rStyle w:val="Gl"/>
+          <w:rFonts w:asciiTheme="minorHAnsi" w:eastAsiaTheme="majorEastAsia" w:hAnsiTheme="minorHAnsi"/>
+        </w:rPr>
+        <w:t xml:space="preserve"> [</w:t>
+      </w:r>
+      <w:proofErr w:type="spellStart"/>
+      <w:r>
+        <w:rPr>
+          <w:rStyle w:val="Gl"/>
+          <w:rFonts w:asciiTheme="minorHAnsi" w:eastAsiaTheme="majorEastAsia" w:hAnsiTheme="minorHAnsi"/>
+        </w:rPr>
+        <w:t>oyunumuzun</w:t>
+      </w:r>
+      <w:proofErr w:type="spellEnd"/>
+      <w:r>
+        <w:rPr>
+          <w:rStyle w:val="Gl"/>
+          <w:rFonts w:asciiTheme="minorHAnsi" w:eastAsiaTheme="majorEastAsia" w:hAnsiTheme="minorHAnsi"/>
+        </w:rPr>
+        <w:t xml:space="preserve"> </w:t>
+      </w:r>
+      <w:proofErr w:type="spellStart"/>
+      <w:r>
+        <w:rPr>
+          <w:rStyle w:val="Gl"/>
+          <w:rFonts w:asciiTheme="minorHAnsi" w:eastAsiaTheme="majorEastAsia" w:hAnsiTheme="minorHAnsi"/>
+        </w:rPr>
+        <w:t>ismi</w:t>
+      </w:r>
+      <w:proofErr w:type="spellEnd"/>
+      <w:r>
+        <w:rPr>
+          <w:rStyle w:val="Gl"/>
+          <w:rFonts w:asciiTheme="minorHAnsi" w:eastAsiaTheme="majorEastAsia" w:hAnsiTheme="minorHAnsi"/>
+        </w:rPr>
+        <w:t xml:space="preserve"> belli </w:t>
+      </w:r>
+      <w:proofErr w:type="spellStart"/>
+      <w:r>
+        <w:rPr>
+          <w:rStyle w:val="Gl"/>
+          <w:rFonts w:asciiTheme="minorHAnsi" w:eastAsiaTheme="majorEastAsia" w:hAnsiTheme="minorHAnsi"/>
+        </w:rPr>
+        <w:t>değil</w:t>
+      </w:r>
+      <w:proofErr w:type="spellEnd"/>
+      <w:r>
+        <w:rPr>
+          <w:rStyle w:val="Gl"/>
+          <w:rFonts w:asciiTheme="minorHAnsi" w:eastAsiaTheme="majorEastAsia" w:hAnsiTheme="minorHAnsi"/>
+        </w:rPr>
+        <w:t xml:space="preserve">] </w:t>
+      </w:r>
+      <w:proofErr w:type="spellStart"/>
+      <w:r>
+        <w:rPr>
+          <w:rStyle w:val="Gl"/>
+          <w:rFonts w:asciiTheme="minorHAnsi" w:eastAsiaTheme="majorEastAsia" w:hAnsiTheme="minorHAnsi"/>
+        </w:rPr>
+        <w:t>bir</w:t>
+      </w:r>
+      <w:proofErr w:type="spellEnd"/>
+      <w:r>
+        <w:rPr>
+          <w:rStyle w:val="Gl"/>
+          <w:rFonts w:asciiTheme="minorHAnsi" w:eastAsiaTheme="majorEastAsia" w:hAnsiTheme="minorHAnsi"/>
+        </w:rPr>
+        <w:t xml:space="preserve"> </w:t>
+      </w:r>
+      <w:proofErr w:type="spellStart"/>
+      <w:r>
+        <w:rPr>
+          <w:rStyle w:val="Gl"/>
+          <w:rFonts w:asciiTheme="minorHAnsi" w:eastAsiaTheme="majorEastAsia" w:hAnsiTheme="minorHAnsi"/>
+        </w:rPr>
+        <w:t>roguelite</w:t>
+      </w:r>
+      <w:proofErr w:type="spellEnd"/>
+      <w:r>
+        <w:rPr>
+          <w:rStyle w:val="Gl"/>
+          <w:rFonts w:asciiTheme="minorHAnsi" w:eastAsiaTheme="majorEastAsia" w:hAnsiTheme="minorHAnsi"/>
+        </w:rPr>
+        <w:t xml:space="preserve"> bullet hell </w:t>
+      </w:r>
+      <w:proofErr w:type="spellStart"/>
+      <w:r>
+        <w:rPr>
+          <w:rStyle w:val="Gl"/>
+          <w:rFonts w:asciiTheme="minorHAnsi" w:eastAsiaTheme="majorEastAsia" w:hAnsiTheme="minorHAnsi"/>
+        </w:rPr>
+        <w:t>tarzı</w:t>
+      </w:r>
+      <w:proofErr w:type="spellEnd"/>
+      <w:r>
+        <w:rPr>
+          <w:rStyle w:val="Gl"/>
+          <w:rFonts w:asciiTheme="minorHAnsi" w:eastAsiaTheme="majorEastAsia" w:hAnsiTheme="minorHAnsi"/>
+        </w:rPr>
+        <w:t xml:space="preserve"> </w:t>
+      </w:r>
+      <w:proofErr w:type="spellStart"/>
+      <w:r>
+        <w:rPr>
+          <w:rStyle w:val="Gl"/>
+          <w:rFonts w:asciiTheme="minorHAnsi" w:eastAsiaTheme="majorEastAsia" w:hAnsiTheme="minorHAnsi"/>
+        </w:rPr>
+        <w:t>oyundur</w:t>
+      </w:r>
+      <w:proofErr w:type="spellEnd"/>
+      <w:r>
+        <w:rPr>
+          <w:rStyle w:val="Gl"/>
+          <w:rFonts w:asciiTheme="minorHAnsi" w:eastAsiaTheme="majorEastAsia" w:hAnsiTheme="minorHAnsi"/>
+        </w:rPr>
+        <w:t xml:space="preserve">. </w:t>
+      </w:r>
+      <w:proofErr w:type="spellStart"/>
+      <w:r>
+        <w:rPr>
+          <w:rStyle w:val="Gl"/>
+          <w:rFonts w:asciiTheme="minorHAnsi" w:eastAsiaTheme="majorEastAsia" w:hAnsiTheme="minorHAnsi"/>
+        </w:rPr>
+        <w:t>Tüm</w:t>
+      </w:r>
+      <w:proofErr w:type="spellEnd"/>
+      <w:r>
+        <w:rPr>
+          <w:rStyle w:val="Gl"/>
+          <w:rFonts w:asciiTheme="minorHAnsi" w:eastAsiaTheme="majorEastAsia" w:hAnsiTheme="minorHAnsi"/>
+        </w:rPr>
+        <w:t xml:space="preserve"> </w:t>
+      </w:r>
+      <w:proofErr w:type="spellStart"/>
+      <w:r>
+        <w:rPr>
+          <w:rStyle w:val="Gl"/>
+          <w:rFonts w:asciiTheme="minorHAnsi" w:eastAsiaTheme="majorEastAsia" w:hAnsiTheme="minorHAnsi"/>
+        </w:rPr>
+        <w:t>oyuncu</w:t>
+      </w:r>
+      <w:proofErr w:type="spellEnd"/>
+      <w:r>
+        <w:rPr>
+          <w:rStyle w:val="Gl"/>
+          <w:rFonts w:asciiTheme="minorHAnsi" w:eastAsiaTheme="majorEastAsia" w:hAnsiTheme="minorHAnsi"/>
+        </w:rPr>
+        <w:t xml:space="preserve"> </w:t>
+      </w:r>
+      <w:proofErr w:type="spellStart"/>
+      <w:r>
+        <w:rPr>
+          <w:rStyle w:val="Gl"/>
+          <w:rFonts w:asciiTheme="minorHAnsi" w:eastAsiaTheme="majorEastAsia" w:hAnsiTheme="minorHAnsi"/>
+        </w:rPr>
+        <w:t>kitlesine</w:t>
+      </w:r>
+      <w:proofErr w:type="spellEnd"/>
+      <w:r>
+        <w:rPr>
+          <w:rStyle w:val="Gl"/>
+          <w:rFonts w:asciiTheme="minorHAnsi" w:eastAsiaTheme="majorEastAsia" w:hAnsiTheme="minorHAnsi"/>
+        </w:rPr>
+        <w:t xml:space="preserve"> </w:t>
+      </w:r>
+      <w:proofErr w:type="spellStart"/>
+      <w:r>
+        <w:rPr>
+          <w:rStyle w:val="Gl"/>
+          <w:rFonts w:asciiTheme="minorHAnsi" w:eastAsiaTheme="majorEastAsia" w:hAnsiTheme="minorHAnsi"/>
+        </w:rPr>
+        <w:t>eğlenceli</w:t>
+      </w:r>
+      <w:proofErr w:type="spellEnd"/>
+      <w:r>
+        <w:rPr>
+          <w:rStyle w:val="Gl"/>
+          <w:rFonts w:asciiTheme="minorHAnsi" w:eastAsiaTheme="majorEastAsia" w:hAnsiTheme="minorHAnsi"/>
+        </w:rPr>
+        <w:t xml:space="preserve"> </w:t>
+      </w:r>
+      <w:proofErr w:type="spellStart"/>
+      <w:r>
+        <w:rPr>
+          <w:rStyle w:val="Gl"/>
+          <w:rFonts w:asciiTheme="minorHAnsi" w:eastAsiaTheme="majorEastAsia" w:hAnsiTheme="minorHAnsi"/>
+        </w:rPr>
+        <w:t>vakit</w:t>
+      </w:r>
+      <w:proofErr w:type="spellEnd"/>
+      <w:r>
+        <w:rPr>
+          <w:rStyle w:val="Gl"/>
+          <w:rFonts w:asciiTheme="minorHAnsi" w:eastAsiaTheme="majorEastAsia" w:hAnsiTheme="minorHAnsi"/>
+        </w:rPr>
+        <w:t xml:space="preserve"> </w:t>
+      </w:r>
+      <w:proofErr w:type="spellStart"/>
+      <w:r>
+        <w:rPr>
+          <w:rStyle w:val="Gl"/>
+          <w:rFonts w:asciiTheme="minorHAnsi" w:eastAsiaTheme="majorEastAsia" w:hAnsiTheme="minorHAnsi"/>
+        </w:rPr>
+        <w:t>geçirme</w:t>
+      </w:r>
+      <w:proofErr w:type="spellEnd"/>
+      <w:r>
+        <w:rPr>
+          <w:rStyle w:val="Gl"/>
+          <w:rFonts w:asciiTheme="minorHAnsi" w:eastAsiaTheme="majorEastAsia" w:hAnsiTheme="minorHAnsi"/>
+        </w:rPr>
+        <w:t xml:space="preserve"> </w:t>
+      </w:r>
+      <w:proofErr w:type="spellStart"/>
+      <w:r>
+        <w:rPr>
+          <w:rStyle w:val="Gl"/>
+          <w:rFonts w:asciiTheme="minorHAnsi" w:eastAsiaTheme="majorEastAsia" w:hAnsiTheme="minorHAnsi"/>
+        </w:rPr>
+        <w:t>avantajı</w:t>
+      </w:r>
+      <w:proofErr w:type="spellEnd"/>
+      <w:r>
+        <w:rPr>
+          <w:rStyle w:val="Gl"/>
+          <w:rFonts w:asciiTheme="minorHAnsi" w:eastAsiaTheme="majorEastAsia" w:hAnsiTheme="minorHAnsi"/>
+        </w:rPr>
+        <w:t xml:space="preserve"> </w:t>
+      </w:r>
+      <w:proofErr w:type="spellStart"/>
+      <w:r>
+        <w:rPr>
+          <w:rStyle w:val="Gl"/>
+          <w:rFonts w:asciiTheme="minorHAnsi" w:eastAsiaTheme="majorEastAsia" w:hAnsiTheme="minorHAnsi"/>
+        </w:rPr>
+        <w:t>sağlayan</w:t>
+      </w:r>
+      <w:proofErr w:type="spellEnd"/>
+      <w:r>
+        <w:rPr>
+          <w:rStyle w:val="Gl"/>
+          <w:rFonts w:asciiTheme="minorHAnsi" w:eastAsiaTheme="majorEastAsia" w:hAnsiTheme="minorHAnsi"/>
+        </w:rPr>
+        <w:t xml:space="preserve">, </w:t>
+      </w:r>
+      <w:proofErr w:type="spellStart"/>
+      <w:r>
+        <w:rPr>
+          <w:rStyle w:val="Gl"/>
+          <w:rFonts w:asciiTheme="minorHAnsi" w:eastAsiaTheme="majorEastAsia" w:hAnsiTheme="minorHAnsi"/>
+        </w:rPr>
+        <w:t>bu</w:t>
+      </w:r>
+      <w:proofErr w:type="spellEnd"/>
+      <w:r>
+        <w:rPr>
+          <w:rStyle w:val="Gl"/>
+          <w:rFonts w:asciiTheme="minorHAnsi" w:eastAsiaTheme="majorEastAsia" w:hAnsiTheme="minorHAnsi"/>
+        </w:rPr>
+        <w:t xml:space="preserve"> </w:t>
+      </w:r>
+      <w:proofErr w:type="spellStart"/>
+      <w:r>
+        <w:rPr>
+          <w:rStyle w:val="Gl"/>
+          <w:rFonts w:asciiTheme="minorHAnsi" w:eastAsiaTheme="majorEastAsia" w:hAnsiTheme="minorHAnsi"/>
+        </w:rPr>
+        <w:t>tarz</w:t>
+      </w:r>
+      <w:proofErr w:type="spellEnd"/>
+      <w:r>
+        <w:rPr>
+          <w:rStyle w:val="Gl"/>
+          <w:rFonts w:asciiTheme="minorHAnsi" w:eastAsiaTheme="majorEastAsia" w:hAnsiTheme="minorHAnsi"/>
+        </w:rPr>
+        <w:t xml:space="preserve"> </w:t>
+      </w:r>
+      <w:proofErr w:type="spellStart"/>
+      <w:r>
+        <w:rPr>
+          <w:rStyle w:val="Gl"/>
+          <w:rFonts w:asciiTheme="minorHAnsi" w:eastAsiaTheme="majorEastAsia" w:hAnsiTheme="minorHAnsi"/>
+        </w:rPr>
+        <w:t>oyunlardan</w:t>
+      </w:r>
+      <w:proofErr w:type="spellEnd"/>
+      <w:r>
+        <w:rPr>
+          <w:rStyle w:val="Gl"/>
+          <w:rFonts w:asciiTheme="minorHAnsi" w:eastAsiaTheme="majorEastAsia" w:hAnsiTheme="minorHAnsi"/>
+        </w:rPr>
+        <w:t xml:space="preserve"> </w:t>
+      </w:r>
+      <w:proofErr w:type="spellStart"/>
+      <w:r>
+        <w:rPr>
+          <w:rStyle w:val="Gl"/>
+          <w:rFonts w:asciiTheme="minorHAnsi" w:eastAsiaTheme="majorEastAsia" w:hAnsiTheme="minorHAnsi"/>
+        </w:rPr>
+        <w:t>farklı</w:t>
+      </w:r>
+      <w:proofErr w:type="spellEnd"/>
+      <w:r>
+        <w:rPr>
+          <w:rStyle w:val="Gl"/>
+          <w:rFonts w:asciiTheme="minorHAnsi" w:eastAsiaTheme="majorEastAsia" w:hAnsiTheme="minorHAnsi"/>
+        </w:rPr>
+        <w:t xml:space="preserve"> </w:t>
+      </w:r>
+      <w:proofErr w:type="spellStart"/>
+      <w:r>
+        <w:rPr>
+          <w:rStyle w:val="Gl"/>
+          <w:rFonts w:asciiTheme="minorHAnsi" w:eastAsiaTheme="majorEastAsia" w:hAnsiTheme="minorHAnsi"/>
+        </w:rPr>
+        <w:t>olarak</w:t>
+      </w:r>
+      <w:proofErr w:type="spellEnd"/>
+      <w:r>
+        <w:rPr>
+          <w:rStyle w:val="Gl"/>
+          <w:rFonts w:asciiTheme="minorHAnsi" w:eastAsiaTheme="majorEastAsia" w:hAnsiTheme="minorHAnsi"/>
+        </w:rPr>
+        <w:t xml:space="preserve"> </w:t>
+      </w:r>
+      <w:proofErr w:type="spellStart"/>
+      <w:r>
+        <w:rPr>
+          <w:rStyle w:val="Gl"/>
+          <w:rFonts w:asciiTheme="minorHAnsi" w:eastAsiaTheme="majorEastAsia" w:hAnsiTheme="minorHAnsi"/>
+        </w:rPr>
+        <w:t>tek</w:t>
+      </w:r>
+      <w:proofErr w:type="spellEnd"/>
+      <w:r>
+        <w:rPr>
+          <w:rStyle w:val="Gl"/>
+          <w:rFonts w:asciiTheme="minorHAnsi" w:eastAsiaTheme="majorEastAsia" w:hAnsiTheme="minorHAnsi"/>
+        </w:rPr>
+        <w:t xml:space="preserve"> </w:t>
+      </w:r>
+      <w:proofErr w:type="spellStart"/>
+      <w:r>
+        <w:rPr>
+          <w:rStyle w:val="Gl"/>
+          <w:rFonts w:asciiTheme="minorHAnsi" w:eastAsiaTheme="majorEastAsia" w:hAnsiTheme="minorHAnsi"/>
+        </w:rPr>
+        <w:t>bir</w:t>
+      </w:r>
+      <w:proofErr w:type="spellEnd"/>
+      <w:r>
+        <w:rPr>
+          <w:rStyle w:val="Gl"/>
+          <w:rFonts w:asciiTheme="minorHAnsi" w:eastAsiaTheme="majorEastAsia" w:hAnsiTheme="minorHAnsi"/>
+        </w:rPr>
+        <w:t xml:space="preserve"> </w:t>
+      </w:r>
+      <w:proofErr w:type="spellStart"/>
+      <w:r>
+        <w:rPr>
+          <w:rStyle w:val="Gl"/>
+          <w:rFonts w:asciiTheme="minorHAnsi" w:eastAsiaTheme="majorEastAsia" w:hAnsiTheme="minorHAnsi"/>
+        </w:rPr>
+        <w:t>içeriğe</w:t>
+      </w:r>
+      <w:proofErr w:type="spellEnd"/>
+      <w:r>
+        <w:rPr>
+          <w:rStyle w:val="Gl"/>
+          <w:rFonts w:asciiTheme="minorHAnsi" w:eastAsiaTheme="majorEastAsia" w:hAnsiTheme="minorHAnsi"/>
+        </w:rPr>
+        <w:t xml:space="preserve"> </w:t>
+      </w:r>
+      <w:proofErr w:type="spellStart"/>
+      <w:r>
+        <w:rPr>
+          <w:rStyle w:val="Gl"/>
+          <w:rFonts w:asciiTheme="minorHAnsi" w:eastAsiaTheme="majorEastAsia" w:hAnsiTheme="minorHAnsi"/>
+        </w:rPr>
+        <w:t>odaklanmadan</w:t>
+      </w:r>
+      <w:proofErr w:type="spellEnd"/>
+      <w:r>
+        <w:rPr>
+          <w:rStyle w:val="Gl"/>
+          <w:rFonts w:asciiTheme="minorHAnsi" w:eastAsiaTheme="majorEastAsia" w:hAnsiTheme="minorHAnsi"/>
+        </w:rPr>
+        <w:t xml:space="preserve"> </w:t>
+      </w:r>
+      <w:proofErr w:type="spellStart"/>
+      <w:r>
+        <w:rPr>
+          <w:rStyle w:val="Gl"/>
+          <w:rFonts w:asciiTheme="minorHAnsi" w:eastAsiaTheme="majorEastAsia" w:hAnsiTheme="minorHAnsi"/>
+        </w:rPr>
+        <w:t>farklı</w:t>
+      </w:r>
+      <w:proofErr w:type="spellEnd"/>
+      <w:r>
+        <w:rPr>
+          <w:rStyle w:val="Gl"/>
+          <w:rFonts w:asciiTheme="minorHAnsi" w:eastAsiaTheme="majorEastAsia" w:hAnsiTheme="minorHAnsi"/>
+        </w:rPr>
+        <w:t xml:space="preserve"> </w:t>
+      </w:r>
+      <w:proofErr w:type="spellStart"/>
+      <w:r>
+        <w:rPr>
+          <w:rStyle w:val="Gl"/>
+          <w:rFonts w:asciiTheme="minorHAnsi" w:eastAsiaTheme="majorEastAsia" w:hAnsiTheme="minorHAnsi"/>
+        </w:rPr>
+        <w:t>içerikleri</w:t>
+      </w:r>
+      <w:proofErr w:type="spellEnd"/>
+      <w:r>
+        <w:rPr>
+          <w:rStyle w:val="Gl"/>
+          <w:rFonts w:asciiTheme="minorHAnsi" w:eastAsiaTheme="majorEastAsia" w:hAnsiTheme="minorHAnsi"/>
+        </w:rPr>
+        <w:t xml:space="preserve"> </w:t>
+      </w:r>
+      <w:proofErr w:type="spellStart"/>
+      <w:r>
+        <w:rPr>
+          <w:rStyle w:val="Gl"/>
+          <w:rFonts w:asciiTheme="minorHAnsi" w:eastAsiaTheme="majorEastAsia" w:hAnsiTheme="minorHAnsi"/>
+        </w:rPr>
+        <w:t>birleştirerek</w:t>
+      </w:r>
+      <w:proofErr w:type="spellEnd"/>
+      <w:r>
+        <w:rPr>
+          <w:rStyle w:val="Gl"/>
+          <w:rFonts w:asciiTheme="minorHAnsi" w:eastAsiaTheme="majorEastAsia" w:hAnsiTheme="minorHAnsi"/>
+        </w:rPr>
+        <w:t xml:space="preserve"> </w:t>
+      </w:r>
+      <w:proofErr w:type="spellStart"/>
+      <w:r>
+        <w:rPr>
+          <w:rStyle w:val="Gl"/>
+          <w:rFonts w:asciiTheme="minorHAnsi" w:eastAsiaTheme="majorEastAsia" w:hAnsiTheme="minorHAnsi"/>
+        </w:rPr>
+        <w:t>oyunculara</w:t>
+      </w:r>
+      <w:proofErr w:type="spellEnd"/>
+      <w:r>
+        <w:rPr>
+          <w:rStyle w:val="Gl"/>
+          <w:rFonts w:asciiTheme="minorHAnsi" w:eastAsiaTheme="majorEastAsia" w:hAnsiTheme="minorHAnsi"/>
+        </w:rPr>
+        <w:t xml:space="preserve"> </w:t>
+      </w:r>
+      <w:proofErr w:type="spellStart"/>
+      <w:r>
+        <w:rPr>
+          <w:rStyle w:val="Gl"/>
+          <w:rFonts w:asciiTheme="minorHAnsi" w:eastAsiaTheme="majorEastAsia" w:hAnsiTheme="minorHAnsi"/>
+        </w:rPr>
+        <w:t>benzersiz</w:t>
+      </w:r>
+      <w:proofErr w:type="spellEnd"/>
+      <w:r>
+        <w:rPr>
+          <w:rStyle w:val="Gl"/>
+          <w:rFonts w:asciiTheme="minorHAnsi" w:eastAsiaTheme="majorEastAsia" w:hAnsiTheme="minorHAnsi"/>
+        </w:rPr>
+        <w:t xml:space="preserve"> </w:t>
+      </w:r>
+      <w:proofErr w:type="spellStart"/>
+      <w:r>
+        <w:rPr>
+          <w:rStyle w:val="Gl"/>
+          <w:rFonts w:asciiTheme="minorHAnsi" w:eastAsiaTheme="majorEastAsia" w:hAnsiTheme="minorHAnsi"/>
+        </w:rPr>
+        <w:t>bir</w:t>
+      </w:r>
+      <w:proofErr w:type="spellEnd"/>
+      <w:r>
+        <w:rPr>
+          <w:rStyle w:val="Gl"/>
+          <w:rFonts w:asciiTheme="minorHAnsi" w:eastAsiaTheme="majorEastAsia" w:hAnsiTheme="minorHAnsi"/>
+        </w:rPr>
+        <w:t xml:space="preserve"> </w:t>
+      </w:r>
+      <w:proofErr w:type="spellStart"/>
+      <w:r>
+        <w:rPr>
+          <w:rStyle w:val="Gl"/>
+          <w:rFonts w:asciiTheme="minorHAnsi" w:eastAsiaTheme="majorEastAsia" w:hAnsiTheme="minorHAnsi"/>
+        </w:rPr>
+        <w:t>deneyim</w:t>
+      </w:r>
+      <w:proofErr w:type="spellEnd"/>
+      <w:r>
+        <w:rPr>
+          <w:rStyle w:val="Gl"/>
+          <w:rFonts w:asciiTheme="minorHAnsi" w:eastAsiaTheme="majorEastAsia" w:hAnsiTheme="minorHAnsi"/>
+        </w:rPr>
+        <w:t xml:space="preserve"> </w:t>
+      </w:r>
+      <w:proofErr w:type="spellStart"/>
+      <w:r>
+        <w:rPr>
+          <w:rStyle w:val="Gl"/>
+          <w:rFonts w:asciiTheme="minorHAnsi" w:eastAsiaTheme="majorEastAsia" w:hAnsiTheme="minorHAnsi"/>
+        </w:rPr>
+        <w:t>sunar</w:t>
+      </w:r>
+      <w:proofErr w:type="spellEnd"/>
+      <w:r>
+        <w:rPr>
+          <w:rStyle w:val="Gl"/>
+          <w:rFonts w:asciiTheme="minorHAnsi" w:eastAsiaTheme="majorEastAsia" w:hAnsiTheme="minorHAnsi"/>
+        </w:rPr>
+        <w:t>.”</w:t>
       </w:r>
     </w:p>
     <w:p>
@@ -744,8 +4285,39 @@
           <w:b w:val="0"/>
           <w:bCs w:val="0"/>
         </w:rPr>
-        <w:t xml:space="preserve"> olarak kararlaştırılmıştır</w:t>
-      </w:r>
+        <w:t xml:space="preserve"> </w:t>
+      </w:r>
+      <w:proofErr w:type="spellStart"/>
+      <w:r>
+        <w:rPr>
+          <w:rStyle w:val="Gl"/>
+          <w:rFonts w:asciiTheme="minorHAnsi" w:eastAsiaTheme="majorEastAsia" w:hAnsiTheme="minorHAnsi"/>
+          <w:b w:val="0"/>
+          <w:bCs w:val="0"/>
+        </w:rPr>
+        <w:t>olarak</w:t>
+      </w:r>
+      <w:proofErr w:type="spellEnd"/>
+      <w:r>
+        <w:rPr>
+          <w:rStyle w:val="Gl"/>
+          <w:rFonts w:asciiTheme="minorHAnsi" w:eastAsiaTheme="majorEastAsia" w:hAnsiTheme="minorHAnsi"/>
+          <w:b w:val="0"/>
+          <w:bCs w:val="0"/>
+        </w:rPr>
+        <w:t xml:space="preserve"> </w:t>
+      </w:r>
+      <w:proofErr w:type="spellStart"/>
+      <w:r>
+        <w:rPr>
+          <w:rStyle w:val="Gl"/>
+          <w:rFonts w:asciiTheme="minorHAnsi" w:eastAsiaTheme="majorEastAsia" w:hAnsiTheme="minorHAnsi"/>
+          <w:b w:val="0"/>
+          <w:bCs w:val="0"/>
+        </w:rPr>
+        <w:t>kararlaştırılmıştır</w:t>
+      </w:r>
+      <w:proofErr w:type="spellEnd"/>
       <w:r>
         <w:rPr>
           <w:rStyle w:val="Gl"/>
@@ -765,12 +4337,107 @@
         </w:numPr>
         <w:spacing w:after="120" w:line="278" w:lineRule="auto"/>
       </w:pPr>
-      <w:r>
-        <w:t>Görevlerin haftalara ayrılmış şekilde planlanması, ağırlıklandırılması ve ekip üyelerine dengeli biçimde dağıtılması</w:t>
-      </w:r>
-      <w:r>
-        <w:t xml:space="preserve"> bitirilmiştir</w:t>
-      </w:r>
+      <w:proofErr w:type="spellStart"/>
+      <w:r>
+        <w:t>Görevlerin</w:t>
+      </w:r>
+      <w:proofErr w:type="spellEnd"/>
+      <w:r>
+        <w:t xml:space="preserve"> </w:t>
+      </w:r>
+      <w:proofErr w:type="spellStart"/>
+      <w:r>
+        <w:t>haftalara</w:t>
+      </w:r>
+      <w:proofErr w:type="spellEnd"/>
+      <w:r>
+        <w:t xml:space="preserve"> </w:t>
+      </w:r>
+      <w:proofErr w:type="spellStart"/>
+      <w:r>
+        <w:t>ayrılmış</w:t>
+      </w:r>
+      <w:proofErr w:type="spellEnd"/>
+      <w:r>
+        <w:t xml:space="preserve"> </w:t>
+      </w:r>
+      <w:proofErr w:type="spellStart"/>
+      <w:r>
+        <w:t>şekilde</w:t>
+      </w:r>
+      <w:proofErr w:type="spellEnd"/>
+      <w:r>
+        <w:t xml:space="preserve"> </w:t>
+      </w:r>
+      <w:proofErr w:type="spellStart"/>
+      <w:r>
+        <w:t>planlanması</w:t>
+      </w:r>
+      <w:proofErr w:type="spellEnd"/>
+      <w:r>
+        <w:t xml:space="preserve">, </w:t>
+      </w:r>
+      <w:proofErr w:type="spellStart"/>
+      <w:r>
+        <w:t>ağırlıklandırılması</w:t>
+      </w:r>
+      <w:proofErr w:type="spellEnd"/>
+      <w:r>
+        <w:t xml:space="preserve"> </w:t>
+      </w:r>
+      <w:proofErr w:type="spellStart"/>
+      <w:r>
+        <w:t>ve</w:t>
+      </w:r>
+      <w:proofErr w:type="spellEnd"/>
+      <w:r>
+        <w:t xml:space="preserve"> </w:t>
+      </w:r>
+      <w:proofErr w:type="spellStart"/>
+      <w:r>
+        <w:t>ekip</w:t>
+      </w:r>
+      <w:proofErr w:type="spellEnd"/>
+      <w:r>
+        <w:t xml:space="preserve"> </w:t>
+      </w:r>
+      <w:proofErr w:type="spellStart"/>
+      <w:r>
+        <w:t>üyelerine</w:t>
+      </w:r>
+      <w:proofErr w:type="spellEnd"/>
+      <w:r>
+        <w:t xml:space="preserve"> </w:t>
+      </w:r>
+      <w:proofErr w:type="spellStart"/>
+      <w:r>
+        <w:t>dengeli</w:t>
+      </w:r>
+      <w:proofErr w:type="spellEnd"/>
+      <w:r>
+        <w:t xml:space="preserve"> </w:t>
+      </w:r>
+      <w:proofErr w:type="spellStart"/>
+      <w:r>
+        <w:t>biçimde</w:t>
+      </w:r>
+      <w:proofErr w:type="spellEnd"/>
+      <w:r>
+        <w:t xml:space="preserve"> </w:t>
+      </w:r>
+      <w:proofErr w:type="spellStart"/>
+      <w:r>
+        <w:t>dağıtılması</w:t>
+      </w:r>
+      <w:proofErr w:type="spellEnd"/>
+      <w:r>
+        <w:t xml:space="preserve"> </w:t>
+      </w:r>
+      <w:proofErr w:type="spellStart"/>
+      <w:r>
+        <w:t>bitirilmiştir</w:t>
+      </w:r>
+      <w:proofErr w:type="spellEnd"/>
       <w:r>
         <w:t xml:space="preserve">. </w:t>
       </w:r>
@@ -784,11 +4451,80 @@
         </w:numPr>
         <w:spacing w:after="120" w:line="278" w:lineRule="auto"/>
       </w:pPr>
+      <w:proofErr w:type="spellStart"/>
       <w:r>
         <w:t>P</w:t>
       </w:r>
       <w:r>
-        <w:t>aydaş çerçevesi genişletilmiş ve projenin vizyonu net bir şekilde tanımlanmıştır.</w:t>
+        <w:t>aydaş</w:t>
+      </w:r>
+      <w:proofErr w:type="spellEnd"/>
+      <w:r>
+        <w:t xml:space="preserve"> </w:t>
+      </w:r>
+      <w:proofErr w:type="spellStart"/>
+      <w:r>
+        <w:t>çerçevesi</w:t>
+      </w:r>
+      <w:proofErr w:type="spellEnd"/>
+      <w:r>
+        <w:t xml:space="preserve"> </w:t>
+      </w:r>
+      <w:proofErr w:type="spellStart"/>
+      <w:r>
+        <w:t>genişletilmiş</w:t>
+      </w:r>
+      <w:proofErr w:type="spellEnd"/>
+      <w:r>
+        <w:t xml:space="preserve"> </w:t>
+      </w:r>
+      <w:proofErr w:type="spellStart"/>
+      <w:r>
+        <w:t>ve</w:t>
+      </w:r>
+      <w:proofErr w:type="spellEnd"/>
+      <w:r>
+        <w:t xml:space="preserve"> </w:t>
+      </w:r>
+      <w:proofErr w:type="spellStart"/>
+      <w:r>
+        <w:t>projenin</w:t>
+      </w:r>
+      <w:proofErr w:type="spellEnd"/>
+      <w:r>
+        <w:t xml:space="preserve"> </w:t>
+      </w:r>
+      <w:proofErr w:type="spellStart"/>
+      <w:r>
+        <w:t>vizyonu</w:t>
+      </w:r>
+      <w:proofErr w:type="spellEnd"/>
+      <w:r>
+        <w:t xml:space="preserve"> net </w:t>
+      </w:r>
+      <w:proofErr w:type="spellStart"/>
+      <w:r>
+        <w:t>bir</w:t>
+      </w:r>
+      <w:proofErr w:type="spellEnd"/>
+      <w:r>
+        <w:t xml:space="preserve"> </w:t>
+      </w:r>
+      <w:proofErr w:type="spellStart"/>
+      <w:r>
+        <w:t>şekilde</w:t>
+      </w:r>
+      <w:proofErr w:type="spellEnd"/>
+      <w:r>
+        <w:t xml:space="preserve"> </w:t>
+      </w:r>
+      <w:proofErr w:type="spellStart"/>
+      <w:r>
+        <w:t>tanımlanmıştır</w:t>
+      </w:r>
+      <w:proofErr w:type="spellEnd"/>
+      <w:r>
+        <w:t>.</w:t>
       </w:r>
     </w:p>
     <w:p>
@@ -801,7 +4537,31 @@
         <w:spacing w:after="120" w:line="278" w:lineRule="auto"/>
       </w:pPr>
       <w:r>
-        <w:t>Oyun ismine karar verilemedi.</w:t>
+        <w:t xml:space="preserve">Oyun </w:t>
+      </w:r>
+      <w:proofErr w:type="spellStart"/>
+      <w:r>
+        <w:t>ismine</w:t>
+      </w:r>
+      <w:proofErr w:type="spellEnd"/>
+      <w:r>
+        <w:t xml:space="preserve"> </w:t>
+      </w:r>
+      <w:proofErr w:type="spellStart"/>
+      <w:r>
+        <w:t>karar</w:t>
+      </w:r>
+      <w:proofErr w:type="spellEnd"/>
+      <w:r>
+        <w:t xml:space="preserve"> </w:t>
+      </w:r>
+      <w:proofErr w:type="spellStart"/>
+      <w:r>
+        <w:t>verilemedi</w:t>
+      </w:r>
+      <w:proofErr w:type="spellEnd"/>
+      <w:r>
+        <w:t>.</w:t>
       </w:r>
     </w:p>
     <w:p>
@@ -814,6 +4574,7 @@
           <w:szCs w:val="28"/>
         </w:rPr>
       </w:pPr>
+      <w:proofErr w:type="spellStart"/>
       <w:r>
         <w:rPr>
           <w:b/>
@@ -821,7 +4582,37 @@
           <w:sz w:val="28"/>
           <w:szCs w:val="28"/>
         </w:rPr>
-        <w:t>Planlanan Görevler:</w:t>
+        <w:t>Planlanan</w:t>
+      </w:r>
+      <w:proofErr w:type="spellEnd"/>
+      <w:r>
+        <w:rPr>
+          <w:b/>
+          <w:bCs/>
+          <w:sz w:val="28"/>
+          <w:szCs w:val="28"/>
+        </w:rPr>
+        <w:t xml:space="preserve"> </w:t>
+      </w:r>
+      <w:proofErr w:type="spellStart"/>
+      <w:r>
+        <w:rPr>
+          <w:b/>
+          <w:bCs/>
+          <w:sz w:val="28"/>
+          <w:szCs w:val="28"/>
+        </w:rPr>
+        <w:t>Görevler</w:t>
+      </w:r>
+      <w:proofErr w:type="spellEnd"/>
+      <w:r>
+        <w:rPr>
+          <w:b/>
+          <w:bCs/>
+          <w:sz w:val="28"/>
+          <w:szCs w:val="28"/>
+        </w:rPr>
+        <w:t>:</w:t>
       </w:r>
     </w:p>
     <w:p>
@@ -833,8 +4624,101 @@
         </w:numPr>
         <w:spacing w:after="160" w:line="278" w:lineRule="auto"/>
       </w:pPr>
-      <w:r>
-        <w:t xml:space="preserve">Gelecek hafta başlanmış olan çekirdek oynanış mekaniklerinin daha işlevsel hâle getirilmesi planlanmaktadır. </w:t>
+      <w:proofErr w:type="spellStart"/>
+      <w:r>
+        <w:t>Gelecek</w:t>
+      </w:r>
+      <w:proofErr w:type="spellEnd"/>
+      <w:r>
+        <w:t xml:space="preserve"> </w:t>
+      </w:r>
+      <w:proofErr w:type="spellStart"/>
+      <w:r>
+        <w:t>hafta</w:t>
+      </w:r>
+      <w:proofErr w:type="spellEnd"/>
+      <w:r>
+        <w:t xml:space="preserve"> </w:t>
+      </w:r>
+      <w:proofErr w:type="spellStart"/>
+      <w:r>
+        <w:t>başlanmış</w:t>
+      </w:r>
+      <w:proofErr w:type="spellEnd"/>
+      <w:r>
+        <w:t xml:space="preserve"> </w:t>
+      </w:r>
+      <w:proofErr w:type="spellStart"/>
+      <w:r>
+        <w:t>olan</w:t>
+      </w:r>
+      <w:proofErr w:type="spellEnd"/>
+      <w:r>
+        <w:t xml:space="preserve"> </w:t>
+      </w:r>
+      <w:proofErr w:type="spellStart"/>
+      <w:r>
+        <w:t>çekirdek</w:t>
+      </w:r>
+      <w:proofErr w:type="spellEnd"/>
+      <w:r>
+        <w:t xml:space="preserve"> </w:t>
+      </w:r>
+      <w:proofErr w:type="spellStart"/>
+      <w:r>
+        <w:t>oynanış</w:t>
+      </w:r>
+      <w:proofErr w:type="spellEnd"/>
+      <w:r>
+        <w:t xml:space="preserve"> </w:t>
+      </w:r>
+      <w:proofErr w:type="spellStart"/>
+      <w:r>
+        <w:t>mekaniklerinin</w:t>
+      </w:r>
+      <w:proofErr w:type="spellEnd"/>
+      <w:r>
+        <w:t xml:space="preserve"> </w:t>
+      </w:r>
+      <w:proofErr w:type="spellStart"/>
+      <w:r>
+        <w:t>daha</w:t>
+      </w:r>
+      <w:proofErr w:type="spellEnd"/>
+      <w:r>
+        <w:t xml:space="preserve"> </w:t>
+      </w:r>
+      <w:proofErr w:type="spellStart"/>
+      <w:r>
+        <w:t>işlevsel</w:t>
+      </w:r>
+      <w:proofErr w:type="spellEnd"/>
+      <w:r>
+        <w:t xml:space="preserve"> </w:t>
+      </w:r>
+      <w:proofErr w:type="spellStart"/>
+      <w:r>
+        <w:t>hâle</w:t>
+      </w:r>
+      <w:proofErr w:type="spellEnd"/>
+      <w:r>
+        <w:t xml:space="preserve"> </w:t>
+      </w:r>
+      <w:proofErr w:type="spellStart"/>
+      <w:r>
+        <w:t>getirilmesi</w:t>
+      </w:r>
+      <w:proofErr w:type="spellEnd"/>
+      <w:r>
+        <w:t xml:space="preserve"> </w:t>
+      </w:r>
+      <w:proofErr w:type="spellStart"/>
+      <w:r>
+        <w:t>planlanmaktadır</w:t>
+      </w:r>
+      <w:proofErr w:type="spellEnd"/>
+      <w:r>
+        <w:t xml:space="preserve">. </w:t>
       </w:r>
     </w:p>
     <w:p>
@@ -846,12 +4730,107 @@
         </w:numPr>
         <w:spacing w:after="160" w:line="278" w:lineRule="auto"/>
       </w:pPr>
-      <w:r>
-        <w:t>Karakter hareketi, temel saldırı sistemi, kamera takibi ve test sahnesi üzerinde sürdürülen çalışmalar</w:t>
-      </w:r>
-      <w:r>
-        <w:t xml:space="preserve"> ilerletilecektir</w:t>
-      </w:r>
+      <w:proofErr w:type="spellStart"/>
+      <w:r>
+        <w:t>Karakter</w:t>
+      </w:r>
+      <w:proofErr w:type="spellEnd"/>
+      <w:r>
+        <w:t xml:space="preserve"> </w:t>
+      </w:r>
+      <w:proofErr w:type="spellStart"/>
+      <w:r>
+        <w:t>hareketi</w:t>
+      </w:r>
+      <w:proofErr w:type="spellEnd"/>
+      <w:r>
+        <w:t xml:space="preserve">, </w:t>
+      </w:r>
+      <w:proofErr w:type="spellStart"/>
+      <w:r>
+        <w:t>temel</w:t>
+      </w:r>
+      <w:proofErr w:type="spellEnd"/>
+      <w:r>
+        <w:t xml:space="preserve"> </w:t>
+      </w:r>
+      <w:proofErr w:type="spellStart"/>
+      <w:r>
+        <w:t>saldırı</w:t>
+      </w:r>
+      <w:proofErr w:type="spellEnd"/>
+      <w:r>
+        <w:t xml:space="preserve"> </w:t>
+      </w:r>
+      <w:proofErr w:type="spellStart"/>
+      <w:r>
+        <w:t>sistemi</w:t>
+      </w:r>
+      <w:proofErr w:type="spellEnd"/>
+      <w:r>
+        <w:t xml:space="preserve">, </w:t>
+      </w:r>
+      <w:proofErr w:type="spellStart"/>
+      <w:r>
+        <w:t>kamera</w:t>
+      </w:r>
+      <w:proofErr w:type="spellEnd"/>
+      <w:r>
+        <w:t xml:space="preserve"> </w:t>
+      </w:r>
+      <w:proofErr w:type="spellStart"/>
+      <w:r>
+        <w:t>takibi</w:t>
+      </w:r>
+      <w:proofErr w:type="spellEnd"/>
+      <w:r>
+        <w:t xml:space="preserve"> </w:t>
+      </w:r>
+      <w:proofErr w:type="spellStart"/>
+      <w:r>
+        <w:t>ve</w:t>
+      </w:r>
+      <w:proofErr w:type="spellEnd"/>
+      <w:r>
+        <w:t xml:space="preserve"> test </w:t>
+      </w:r>
+      <w:proofErr w:type="spellStart"/>
+      <w:r>
+        <w:t>sahnesi</w:t>
+      </w:r>
+      <w:proofErr w:type="spellEnd"/>
+      <w:r>
+        <w:t xml:space="preserve"> </w:t>
+      </w:r>
+      <w:proofErr w:type="spellStart"/>
+      <w:r>
+        <w:t>üzerinde</w:t>
+      </w:r>
+      <w:proofErr w:type="spellEnd"/>
+      <w:r>
+        <w:t xml:space="preserve"> </w:t>
+      </w:r>
+      <w:proofErr w:type="spellStart"/>
+      <w:r>
+        <w:t>sürdürülen</w:t>
+      </w:r>
+      <w:proofErr w:type="spellEnd"/>
+      <w:r>
+        <w:t xml:space="preserve"> </w:t>
+      </w:r>
+      <w:proofErr w:type="spellStart"/>
+      <w:r>
+        <w:t>çalışmalar</w:t>
+      </w:r>
+      <w:proofErr w:type="spellEnd"/>
+      <w:r>
+        <w:t xml:space="preserve"> </w:t>
+      </w:r>
+      <w:proofErr w:type="spellStart"/>
+      <w:r>
+        <w:t>ilerletilecektir</w:t>
+      </w:r>
+      <w:proofErr w:type="spellEnd"/>
       <w:r>
         <w:t>.</w:t>
       </w:r>
@@ -866,7 +4845,159 @@
         <w:spacing w:after="160" w:line="278" w:lineRule="auto"/>
       </w:pPr>
       <w:r>
-        <w:t xml:space="preserve">Bunun yanında GitHub çalışma düzeninin ekip içinde daha sağlam oturtulması, proje dosya yapısının düzenlenmesi ve görev takibinin aktif olarak sürdürülmesi planlanmaktadır. </w:t>
+        <w:t xml:space="preserve">Bunun </w:t>
+      </w:r>
+      <w:proofErr w:type="spellStart"/>
+      <w:r>
+        <w:t>yanında</w:t>
+      </w:r>
+      <w:proofErr w:type="spellEnd"/>
+      <w:r>
+        <w:t xml:space="preserve"> GitHub </w:t>
+      </w:r>
+      <w:proofErr w:type="spellStart"/>
+      <w:r>
+        <w:t>çalışma</w:t>
+      </w:r>
+      <w:proofErr w:type="spellEnd"/>
+      <w:r>
+        <w:t xml:space="preserve"> </w:t>
+      </w:r>
+      <w:proofErr w:type="spellStart"/>
+      <w:r>
+        <w:t>düzeninin</w:t>
+      </w:r>
+      <w:proofErr w:type="spellEnd"/>
+      <w:r>
+        <w:t xml:space="preserve"> </w:t>
+      </w:r>
+      <w:proofErr w:type="spellStart"/>
+      <w:r>
+        <w:t>ekip</w:t>
+      </w:r>
+      <w:proofErr w:type="spellEnd"/>
+      <w:r>
+        <w:t xml:space="preserve"> </w:t>
+      </w:r>
+      <w:proofErr w:type="spellStart"/>
+      <w:r>
+        <w:t>içinde</w:t>
+      </w:r>
+      <w:proofErr w:type="spellEnd"/>
+      <w:r>
+        <w:t xml:space="preserve"> </w:t>
+      </w:r>
+      <w:proofErr w:type="spellStart"/>
+      <w:r>
+        <w:t>daha</w:t>
+      </w:r>
+      <w:proofErr w:type="spellEnd"/>
+      <w:r>
+        <w:t xml:space="preserve"> </w:t>
+      </w:r>
+      <w:proofErr w:type="spellStart"/>
+      <w:r>
+        <w:t>sağlam</w:t>
+      </w:r>
+      <w:proofErr w:type="spellEnd"/>
+      <w:r>
+        <w:t xml:space="preserve"> </w:t>
+      </w:r>
+      <w:proofErr w:type="spellStart"/>
+      <w:r>
+        <w:t>oturtulması</w:t>
+      </w:r>
+      <w:proofErr w:type="spellEnd"/>
+      <w:r>
+        <w:t xml:space="preserve">, </w:t>
+      </w:r>
+      <w:proofErr w:type="spellStart"/>
+      <w:r>
+        <w:t>proje</w:t>
+      </w:r>
+      <w:proofErr w:type="spellEnd"/>
+      <w:r>
+        <w:t xml:space="preserve"> </w:t>
+      </w:r>
+      <w:proofErr w:type="spellStart"/>
+      <w:r>
+        <w:t>dosya</w:t>
+      </w:r>
+      <w:proofErr w:type="spellEnd"/>
+      <w:r>
+        <w:t xml:space="preserve"> </w:t>
+      </w:r>
+      <w:proofErr w:type="spellStart"/>
+      <w:r>
+        <w:t>yapısının</w:t>
+      </w:r>
+      <w:proofErr w:type="spellEnd"/>
+      <w:r>
+        <w:t xml:space="preserve"> </w:t>
+      </w:r>
+      <w:proofErr w:type="spellStart"/>
+      <w:r>
+        <w:t>düzenlenmesi</w:t>
+      </w:r>
+      <w:proofErr w:type="spellEnd"/>
+      <w:r>
+        <w:t xml:space="preserve"> </w:t>
+      </w:r>
+      <w:proofErr w:type="spellStart"/>
+      <w:r>
+        <w:t>ve</w:t>
+      </w:r>
+      <w:proofErr w:type="spellEnd"/>
+      <w:r>
+        <w:t xml:space="preserve"> </w:t>
+      </w:r>
+      <w:proofErr w:type="spellStart"/>
+      <w:r>
+        <w:t>görev</w:t>
+      </w:r>
+      <w:proofErr w:type="spellEnd"/>
+      <w:r>
+        <w:t xml:space="preserve"> </w:t>
+      </w:r>
+      <w:proofErr w:type="spellStart"/>
+      <w:r>
+        <w:t>takibinin</w:t>
+      </w:r>
+      <w:proofErr w:type="spellEnd"/>
+      <w:r>
+        <w:t xml:space="preserve"> </w:t>
+      </w:r>
+      <w:proofErr w:type="spellStart"/>
+      <w:r>
+        <w:t>aktif</w:t>
+      </w:r>
+      <w:proofErr w:type="spellEnd"/>
+      <w:r>
+        <w:t xml:space="preserve"> </w:t>
+      </w:r>
+      <w:proofErr w:type="spellStart"/>
+      <w:r>
+        <w:t>olarak</w:t>
+      </w:r>
+      <w:proofErr w:type="spellEnd"/>
+      <w:r>
+        <w:t xml:space="preserve"> </w:t>
+      </w:r>
+      <w:proofErr w:type="spellStart"/>
+      <w:r>
+        <w:t>sürdürülmesi</w:t>
+      </w:r>
+      <w:proofErr w:type="spellEnd"/>
+      <w:r>
+        <w:t xml:space="preserve"> </w:t>
+      </w:r>
+      <w:proofErr w:type="spellStart"/>
+      <w:r>
+        <w:t>planlanmaktadır</w:t>
+      </w:r>
+      <w:proofErr w:type="spellEnd"/>
+      <w:r>
+        <w:t xml:space="preserve">. </w:t>
       </w:r>
     </w:p>
     <w:p>
@@ -882,11 +5013,80 @@
         <w:t>T</w:t>
       </w:r>
       <w:r>
-        <w:t>emel karakter, silah ve düşman fikirlerinin daha somut hâle getirile</w:t>
+        <w:t xml:space="preserve">emel </w:t>
+      </w:r>
+      <w:proofErr w:type="spellStart"/>
+      <w:r>
+        <w:t>karakter</w:t>
+      </w:r>
+      <w:proofErr w:type="spellEnd"/>
+      <w:r>
+        <w:t xml:space="preserve">, </w:t>
+      </w:r>
+      <w:proofErr w:type="spellStart"/>
+      <w:r>
+        <w:t>silah</w:t>
+      </w:r>
+      <w:proofErr w:type="spellEnd"/>
+      <w:r>
+        <w:t xml:space="preserve"> </w:t>
+      </w:r>
+      <w:proofErr w:type="spellStart"/>
+      <w:r>
+        <w:t>ve</w:t>
+      </w:r>
+      <w:proofErr w:type="spellEnd"/>
+      <w:r>
+        <w:t xml:space="preserve"> </w:t>
+      </w:r>
+      <w:proofErr w:type="spellStart"/>
+      <w:r>
+        <w:t>düşman</w:t>
+      </w:r>
+      <w:proofErr w:type="spellEnd"/>
+      <w:r>
+        <w:t xml:space="preserve"> </w:t>
+      </w:r>
+      <w:proofErr w:type="spellStart"/>
+      <w:r>
+        <w:t>fikirleri</w:t>
+      </w:r>
+      <w:proofErr w:type="spellEnd"/>
+      <w:r>
+        <w:t xml:space="preserve"> </w:t>
+      </w:r>
+      <w:proofErr w:type="spellStart"/>
+      <w:r>
+        <w:t>daha</w:t>
+      </w:r>
+      <w:proofErr w:type="spellEnd"/>
+      <w:r>
+        <w:t xml:space="preserve"> </w:t>
+      </w:r>
+      <w:proofErr w:type="spellStart"/>
+      <w:r>
+        <w:t>somut</w:t>
+      </w:r>
+      <w:proofErr w:type="spellEnd"/>
+      <w:r>
+        <w:t xml:space="preserve"> </w:t>
+      </w:r>
+      <w:proofErr w:type="spellStart"/>
+      <w:r>
+        <w:t>hâle</w:t>
+      </w:r>
+      <w:proofErr w:type="spellEnd"/>
+      <w:r>
+        <w:t xml:space="preserve"> </w:t>
+      </w:r>
+      <w:proofErr w:type="spellStart"/>
+      <w:r>
+        <w:t>getirile</w:t>
       </w:r>
       <w:r>
         <w:t>cektir</w:t>
       </w:r>
+      <w:proofErr w:type="spellEnd"/>
       <w:r>
         <w:t>.</w:t>
       </w:r>
@@ -901,13 +5101,56 @@
         <w:spacing w:after="160" w:line="278" w:lineRule="auto"/>
       </w:pPr>
       <w:r>
-        <w:t>Oyun ismi kararlaştırılana kadar tartışılmaya devam edilecektir.</w:t>
-      </w:r>
-    </w:p>
-    <w:p>
-      <w:pPr>
-        <w:spacing w:after="160" w:line="278" w:lineRule="auto"/>
-      </w:pPr>
+        <w:t xml:space="preserve">Oyun </w:t>
+      </w:r>
+      <w:proofErr w:type="spellStart"/>
+      <w:r>
+        <w:t>ismi</w:t>
+      </w:r>
+      <w:proofErr w:type="spellEnd"/>
+      <w:r>
+        <w:t xml:space="preserve"> </w:t>
+      </w:r>
+      <w:proofErr w:type="spellStart"/>
+      <w:r>
+        <w:t>kararlaştırılana</w:t>
+      </w:r>
+      <w:proofErr w:type="spellEnd"/>
+      <w:r>
+        <w:t xml:space="preserve"> </w:t>
+      </w:r>
+      <w:proofErr w:type="spellStart"/>
+      <w:r>
+        <w:t>kadar</w:t>
+      </w:r>
+      <w:proofErr w:type="spellEnd"/>
+      <w:r>
+        <w:t xml:space="preserve"> </w:t>
+      </w:r>
+      <w:proofErr w:type="spellStart"/>
+      <w:r>
+        <w:t>tartışılmaya</w:t>
+      </w:r>
+      <w:proofErr w:type="spellEnd"/>
+      <w:r>
+        <w:t xml:space="preserve"> </w:t>
+      </w:r>
+      <w:proofErr w:type="spellStart"/>
+      <w:r>
+        <w:t>devam</w:t>
+      </w:r>
+      <w:proofErr w:type="spellEnd"/>
+      <w:r>
+        <w:t xml:space="preserve"> </w:t>
+      </w:r>
+      <w:proofErr w:type="spellStart"/>
+      <w:r>
+        <w:t>edilecektir</w:t>
+      </w:r>
+      <w:proofErr w:type="spellEnd"/>
+      <w:r>
+        <w:t>.</w:t>
+      </w:r>
     </w:p>
     <w:sectPr>
       <w:type w:val="continuous"/>
@@ -3009,6 +7252,7 @@
   <w:style w:type="character" w:default="1" w:styleId="VarsaylanParagrafYazTipi">
     <w:name w:val="Default Paragraph Font"/>
     <w:uiPriority w:val="1"/>
+    <w:semiHidden/>
     <w:unhideWhenUsed/>
   </w:style>
   <w:style w:type="table" w:default="1" w:styleId="NormalTablo">

</xml_diff>